<commit_message>
feat(visualization): add dataset plotting utilities
</commit_message>
<xml_diff>
--- a/docs/roadmap.docx
+++ b/docs/roadmap.docx
@@ -4111,6 +4111,45 @@
           <w:bCs/>
         </w:rPr>
         <w:t>Visualization Engine</w:t>
+      </w:r>
+    </w:p>
+    <w:p>
+      <w:pPr>
+        <w:spacing w:after="0" w:line="240" w:lineRule="auto"/>
+        <w:rPr>
+          <w:b/>
+          <w:bCs/>
+        </w:rPr>
+      </w:pPr>
+      <w:r>
+        <w:rPr>
+          <w:b/>
+          <w:bCs/>
+        </w:rPr>
+        <w:t>Commit 4</w:t>
+      </w:r>
+      <w:r>
+        <w:rPr>
+          <w:b/>
+          <w:bCs/>
+        </w:rPr>
+        <w:t>.1</w:t>
+      </w:r>
+      <w:r>
+        <w:rPr>
+          <w:b/>
+          <w:bCs/>
+        </w:rPr>
+        <w:t xml:space="preserve"> — </w:t>
+      </w:r>
+      <w:r>
+        <w:rPr>
+          <w:b/>
+          <w:bCs/>
+          <w:sz w:val="16"/>
+          <w:szCs w:val="16"/>
+        </w:rPr>
+        <w:t>Battery Visualization Refinement</w:t>
       </w:r>
     </w:p>
     <w:p>

</xml_diff>

<commit_message>
feat(data): implement rolling window generator
</commit_message>
<xml_diff>
--- a/docs/roadmap.docx
+++ b/docs/roadmap.docx
@@ -2438,37 +2438,7 @@
           <w:u w:val="single"/>
         </w:rPr>
         <w:lastRenderedPageBreak/>
-        <w:t xml:space="preserve">Milestone </w:t>
-      </w:r>
-      <w:r>
-        <w:rPr>
-          <w:b/>
-          <w:bCs/>
-          <w:sz w:val="32"/>
-          <w:szCs w:val="32"/>
-          <w:u w:val="single"/>
-        </w:rPr>
-        <w:t>C</w:t>
-      </w:r>
-      <w:r>
-        <w:rPr>
-          <w:b/>
-          <w:bCs/>
-          <w:sz w:val="32"/>
-          <w:szCs w:val="32"/>
-          <w:u w:val="single"/>
-        </w:rPr>
-        <w:t xml:space="preserve">oncept </w:t>
-      </w:r>
-      <w:r>
-        <w:rPr>
-          <w:b/>
-          <w:bCs/>
-          <w:sz w:val="32"/>
-          <w:szCs w:val="32"/>
-          <w:u w:val="single"/>
-        </w:rPr>
-        <w:t>:</w:t>
+        <w:t>Milestone Concept :</w:t>
       </w:r>
     </w:p>
     <w:p>
@@ -2800,44 +2770,23 @@
           <w:b/>
           <w:bCs/>
         </w:rPr>
-        <w:t xml:space="preserve">Commit 2 — </w:t>
-      </w:r>
-      <w:r>
-        <w:rPr>
-          <w:b/>
-          <w:bCs/>
-        </w:rPr>
-        <w:t>Visualization</w:t>
-      </w:r>
-      <w:r>
-        <w:rPr>
-          <w:b/>
-          <w:bCs/>
-        </w:rPr>
-        <w:t xml:space="preserve"> Engine</w:t>
-      </w:r>
-    </w:p>
-    <w:p>
-      <w:pPr>
-        <w:spacing w:after="0" w:line="240" w:lineRule="auto"/>
-        <w:rPr>
-          <w:b/>
-          <w:bCs/>
-        </w:rPr>
-      </w:pPr>
-      <w:r>
-        <w:rPr>
-          <w:b/>
-          <w:bCs/>
-        </w:rPr>
-        <w:t xml:space="preserve">Commit 3 — </w:t>
-      </w:r>
-      <w:r>
-        <w:rPr>
-          <w:b/>
-          <w:bCs/>
-        </w:rPr>
-        <w:t>Window Generator</w:t>
+        <w:t>Commit 2 — Visualization Engine</w:t>
+      </w:r>
+    </w:p>
+    <w:p>
+      <w:pPr>
+        <w:spacing w:after="0" w:line="240" w:lineRule="auto"/>
+        <w:rPr>
+          <w:b/>
+          <w:bCs/>
+        </w:rPr>
+      </w:pPr>
+      <w:r>
+        <w:rPr>
+          <w:b/>
+          <w:bCs/>
+        </w:rPr>
+        <w:t>Commit 3 — Window Generator</w:t>
       </w:r>
     </w:p>
     <w:p>
@@ -3175,14 +3124,7 @@
           <w:sz w:val="28"/>
           <w:szCs w:val="28"/>
         </w:rPr>
-        <w:t>Project skeleton</w:t>
-      </w:r>
-      <w:r>
-        <w:rPr>
-          <w:sz w:val="28"/>
-          <w:szCs w:val="28"/>
-        </w:rPr>
-        <w:t xml:space="preserve">   </w:t>
+        <w:t xml:space="preserve">Project skeleton   </w:t>
       </w:r>
       <w:r>
         <w:rPr>
@@ -3235,14 +3177,7 @@
           <w:sz w:val="28"/>
           <w:szCs w:val="28"/>
         </w:rPr>
-        <w:t>Dataset engine</w:t>
-      </w:r>
-      <w:r>
-        <w:rPr>
-          <w:sz w:val="28"/>
-          <w:szCs w:val="28"/>
-        </w:rPr>
-        <w:t xml:space="preserve">    </w:t>
+        <w:t xml:space="preserve">Dataset engine    </w:t>
       </w:r>
       <w:r>
         <w:rPr>
@@ -3295,14 +3230,7 @@
           <w:sz w:val="28"/>
           <w:szCs w:val="28"/>
         </w:rPr>
-        <w:t>Data engineering</w:t>
-      </w:r>
-      <w:r>
-        <w:rPr>
-          <w:sz w:val="28"/>
-          <w:szCs w:val="28"/>
-        </w:rPr>
-        <w:t xml:space="preserve">  </w:t>
+        <w:t xml:space="preserve">Data engineering  </w:t>
       </w:r>
       <w:r>
         <w:rPr>
@@ -4245,6 +4173,1012 @@
           <w:szCs w:val="28"/>
         </w:rPr>
       </w:pPr>
+    </w:p>
+    <w:p>
+      <w:pPr>
+        <w:spacing w:after="0" w:line="240" w:lineRule="auto"/>
+        <w:rPr>
+          <w:sz w:val="28"/>
+          <w:szCs w:val="28"/>
+        </w:rPr>
+      </w:pPr>
+    </w:p>
+    <w:p>
+      <w:pPr>
+        <w:spacing w:after="0" w:line="240" w:lineRule="auto"/>
+        <w:rPr>
+          <w:sz w:val="28"/>
+          <w:szCs w:val="28"/>
+          <w:lang w:val="tr-TR"/>
+        </w:rPr>
+      </w:pPr>
+      <w:r>
+        <w:rPr>
+          <w:sz w:val="28"/>
+          <w:szCs w:val="28"/>
+          <w:lang w:val="tr-TR"/>
+        </w:rPr>
+        <w:t>Proje, tek bir deneysel betikten, net bir yol haritasına sahip modüler bir araştırma çerçevesine evrildi.</w:t>
+      </w:r>
+    </w:p>
+    <w:p>
+      <w:pPr>
+        <w:spacing w:after="0" w:line="240" w:lineRule="auto"/>
+        <w:rPr>
+          <w:sz w:val="28"/>
+          <w:szCs w:val="28"/>
+        </w:rPr>
+      </w:pPr>
+    </w:p>
+    <w:p>
+      <w:pPr>
+        <w:spacing w:after="0" w:line="240" w:lineRule="auto"/>
+        <w:rPr>
+          <w:b/>
+          <w:bCs/>
+          <w:sz w:val="28"/>
+          <w:szCs w:val="28"/>
+          <w:lang w:val="tr-TR"/>
+        </w:rPr>
+      </w:pPr>
+      <w:r>
+        <w:rPr>
+          <w:b/>
+          <w:bCs/>
+          <w:sz w:val="28"/>
+          <w:szCs w:val="28"/>
+          <w:lang w:val="tr-TR"/>
+        </w:rPr>
+        <w:t>Sprint 3</w:t>
+      </w:r>
+    </w:p>
+    <w:p>
+      <w:pPr>
+        <w:spacing w:after="0" w:line="240" w:lineRule="auto"/>
+        <w:rPr>
+          <w:sz w:val="28"/>
+          <w:szCs w:val="28"/>
+        </w:rPr>
+      </w:pPr>
+      <w:r>
+        <w:rPr>
+          <w:rFonts w:ascii="Segoe UI Symbol" w:hAnsi="Segoe UI Symbol" w:cs="Segoe UI Symbol"/>
+          <w:sz w:val="28"/>
+          <w:szCs w:val="28"/>
+        </w:rPr>
+        <w:t>✔</w:t>
+      </w:r>
+      <w:r>
+        <w:rPr>
+          <w:sz w:val="28"/>
+          <w:szCs w:val="28"/>
+        </w:rPr>
+        <w:t xml:space="preserve"> Commit 1 — Resampling</w:t>
+      </w:r>
+    </w:p>
+    <w:p>
+      <w:pPr>
+        <w:spacing w:after="0" w:line="240" w:lineRule="auto"/>
+        <w:rPr>
+          <w:sz w:val="28"/>
+          <w:szCs w:val="28"/>
+        </w:rPr>
+      </w:pPr>
+      <w:r>
+        <w:rPr>
+          <w:rFonts w:ascii="Segoe UI Symbol" w:hAnsi="Segoe UI Symbol" w:cs="Segoe UI Symbol"/>
+          <w:sz w:val="28"/>
+          <w:szCs w:val="28"/>
+        </w:rPr>
+        <w:t>✔</w:t>
+      </w:r>
+      <w:r>
+        <w:rPr>
+          <w:sz w:val="28"/>
+          <w:szCs w:val="28"/>
+        </w:rPr>
+        <w:t xml:space="preserve"> Commit 2 — Feature Engineering</w:t>
+      </w:r>
+    </w:p>
+    <w:p>
+      <w:pPr>
+        <w:spacing w:after="0" w:line="240" w:lineRule="auto"/>
+        <w:rPr>
+          <w:sz w:val="28"/>
+          <w:szCs w:val="28"/>
+        </w:rPr>
+      </w:pPr>
+      <w:r>
+        <w:rPr>
+          <w:rFonts w:ascii="Segoe UI Symbol" w:hAnsi="Segoe UI Symbol" w:cs="Segoe UI Symbol"/>
+          <w:sz w:val="28"/>
+          <w:szCs w:val="28"/>
+        </w:rPr>
+        <w:t>✔</w:t>
+      </w:r>
+      <w:r>
+        <w:rPr>
+          <w:sz w:val="28"/>
+          <w:szCs w:val="28"/>
+        </w:rPr>
+        <w:t xml:space="preserve"> Commit 3 — Visualization</w:t>
+      </w:r>
+    </w:p>
+    <w:p>
+      <w:pPr>
+        <w:spacing w:after="0" w:line="240" w:lineRule="auto"/>
+        <w:rPr>
+          <w:sz w:val="20"/>
+          <w:szCs w:val="20"/>
+        </w:rPr>
+      </w:pPr>
+      <w:r>
+        <w:rPr>
+          <w:rFonts w:ascii="Segoe UI Symbol" w:hAnsi="Segoe UI Symbol" w:cs="Segoe UI Symbol"/>
+          <w:sz w:val="28"/>
+          <w:szCs w:val="28"/>
+        </w:rPr>
+        <w:t>✔</w:t>
+      </w:r>
+      <w:r>
+        <w:rPr>
+          <w:sz w:val="28"/>
+          <w:szCs w:val="28"/>
+        </w:rPr>
+        <w:t xml:space="preserve"> Commit 4 — </w:t>
+      </w:r>
+      <w:r>
+        <w:rPr>
+          <w:sz w:val="20"/>
+          <w:szCs w:val="20"/>
+        </w:rPr>
+        <w:t>Visualization refinement</w:t>
+      </w:r>
+    </w:p>
+    <w:p>
+      <w:pPr>
+        <w:spacing w:after="0" w:line="240" w:lineRule="auto"/>
+        <w:rPr>
+          <w:sz w:val="20"/>
+          <w:szCs w:val="20"/>
+        </w:rPr>
+      </w:pPr>
+      <w:r>
+        <w:rPr>
+          <w:rFonts w:ascii="Segoe UI Symbol" w:hAnsi="Segoe UI Symbol" w:cs="Segoe UI Symbol"/>
+          <w:sz w:val="28"/>
+          <w:szCs w:val="28"/>
+        </w:rPr>
+        <w:t>➡</w:t>
+      </w:r>
+      <w:r>
+        <w:rPr>
+          <w:sz w:val="28"/>
+          <w:szCs w:val="28"/>
+        </w:rPr>
+        <w:t xml:space="preserve"> Commit 5 — </w:t>
+      </w:r>
+      <w:r>
+        <w:rPr>
+          <w:b/>
+          <w:bCs/>
+          <w:sz w:val="20"/>
+          <w:szCs w:val="20"/>
+        </w:rPr>
+        <w:t>Rolling Window Generator</w:t>
+      </w:r>
+    </w:p>
+    <w:p>
+      <w:pPr>
+        <w:spacing w:after="0" w:line="240" w:lineRule="auto"/>
+        <w:rPr>
+          <w:sz w:val="20"/>
+          <w:szCs w:val="20"/>
+        </w:rPr>
+      </w:pPr>
+      <w:r>
+        <w:rPr>
+          <w:rFonts w:ascii="Segoe UI Symbol" w:hAnsi="Segoe UI Symbol" w:cs="Segoe UI Symbol"/>
+          <w:sz w:val="28"/>
+          <w:szCs w:val="28"/>
+        </w:rPr>
+        <w:t>➡</w:t>
+      </w:r>
+      <w:r>
+        <w:rPr>
+          <w:sz w:val="28"/>
+          <w:szCs w:val="28"/>
+        </w:rPr>
+        <w:t xml:space="preserve"> Commit 6 — </w:t>
+      </w:r>
+      <w:r>
+        <w:rPr>
+          <w:b/>
+          <w:bCs/>
+          <w:sz w:val="20"/>
+          <w:szCs w:val="20"/>
+        </w:rPr>
+        <w:t>Battery Analysis Report</w:t>
+      </w:r>
+    </w:p>
+    <w:p>
+      <w:pPr>
+        <w:spacing w:after="0" w:line="240" w:lineRule="auto"/>
+        <w:rPr>
+          <w:sz w:val="28"/>
+          <w:szCs w:val="28"/>
+        </w:rPr>
+      </w:pPr>
+    </w:p>
+    <w:p>
+      <w:pPr>
+        <w:spacing w:after="0" w:line="240" w:lineRule="auto"/>
+        <w:rPr>
+          <w:sz w:val="28"/>
+          <w:szCs w:val="28"/>
+        </w:rPr>
+      </w:pPr>
+    </w:p>
+    <w:p>
+      <w:pPr>
+        <w:spacing w:after="0" w:line="240" w:lineRule="auto"/>
+        <w:rPr>
+          <w:sz w:val="28"/>
+          <w:szCs w:val="28"/>
+        </w:rPr>
+      </w:pPr>
+    </w:p>
+    <w:p>
+      <w:pPr>
+        <w:spacing w:after="0" w:line="240" w:lineRule="auto"/>
+        <w:rPr>
+          <w:sz w:val="28"/>
+          <w:szCs w:val="28"/>
+        </w:rPr>
+      </w:pPr>
+    </w:p>
+    <w:p>
+      <w:pPr>
+        <w:spacing w:after="0" w:line="240" w:lineRule="auto"/>
+        <w:rPr>
+          <w:sz w:val="28"/>
+          <w:szCs w:val="28"/>
+        </w:rPr>
+      </w:pPr>
+    </w:p>
+    <w:p>
+      <w:pPr>
+        <w:spacing w:after="0" w:line="240" w:lineRule="auto"/>
+        <w:rPr>
+          <w:sz w:val="28"/>
+          <w:szCs w:val="28"/>
+        </w:rPr>
+      </w:pPr>
+    </w:p>
+    <w:p>
+      <w:pPr>
+        <w:spacing w:after="0" w:line="240" w:lineRule="auto"/>
+        <w:rPr>
+          <w:sz w:val="28"/>
+          <w:szCs w:val="28"/>
+        </w:rPr>
+      </w:pPr>
+    </w:p>
+    <w:p>
+      <w:pPr>
+        <w:spacing w:after="0" w:line="240" w:lineRule="auto"/>
+        <w:rPr>
+          <w:sz w:val="28"/>
+          <w:szCs w:val="28"/>
+        </w:rPr>
+      </w:pPr>
+    </w:p>
+    <w:p>
+      <w:pPr>
+        <w:spacing w:after="0" w:line="240" w:lineRule="auto"/>
+        <w:rPr>
+          <w:sz w:val="28"/>
+          <w:szCs w:val="28"/>
+        </w:rPr>
+      </w:pPr>
+    </w:p>
+    <w:p>
+      <w:pPr>
+        <w:spacing w:after="0" w:line="240" w:lineRule="auto"/>
+        <w:rPr>
+          <w:sz w:val="28"/>
+          <w:szCs w:val="28"/>
+        </w:rPr>
+      </w:pPr>
+    </w:p>
+    <w:p>
+      <w:pPr>
+        <w:spacing w:after="0" w:line="240" w:lineRule="auto"/>
+        <w:rPr>
+          <w:b/>
+          <w:bCs/>
+          <w:sz w:val="28"/>
+          <w:szCs w:val="28"/>
+        </w:rPr>
+      </w:pPr>
+      <w:r>
+        <w:rPr>
+          <w:b/>
+          <w:bCs/>
+          <w:sz w:val="28"/>
+          <w:szCs w:val="28"/>
+        </w:rPr>
+        <w:t>Sprint 1</w:t>
+      </w:r>
+    </w:p>
+    <w:p>
+      <w:pPr>
+        <w:numPr>
+          <w:ilvl w:val="0"/>
+          <w:numId w:val="4"/>
+        </w:numPr>
+        <w:spacing w:after="0" w:line="240" w:lineRule="auto"/>
+        <w:rPr>
+          <w:sz w:val="28"/>
+          <w:szCs w:val="28"/>
+        </w:rPr>
+      </w:pPr>
+      <w:r>
+        <w:rPr>
+          <w:sz w:val="28"/>
+          <w:szCs w:val="28"/>
+        </w:rPr>
+        <w:t xml:space="preserve">Repository </w:t>
+      </w:r>
+    </w:p>
+    <w:p>
+      <w:pPr>
+        <w:numPr>
+          <w:ilvl w:val="0"/>
+          <w:numId w:val="4"/>
+        </w:numPr>
+        <w:spacing w:after="0" w:line="240" w:lineRule="auto"/>
+        <w:rPr>
+          <w:sz w:val="28"/>
+          <w:szCs w:val="28"/>
+        </w:rPr>
+      </w:pPr>
+      <w:r>
+        <w:rPr>
+          <w:sz w:val="28"/>
+          <w:szCs w:val="28"/>
+        </w:rPr>
+        <w:t xml:space="preserve">Package structure </w:t>
+      </w:r>
+    </w:p>
+    <w:p>
+      <w:pPr>
+        <w:numPr>
+          <w:ilvl w:val="0"/>
+          <w:numId w:val="4"/>
+        </w:numPr>
+        <w:spacing w:after="0" w:line="240" w:lineRule="auto"/>
+        <w:rPr>
+          <w:sz w:val="28"/>
+          <w:szCs w:val="28"/>
+        </w:rPr>
+      </w:pPr>
+      <w:r>
+        <w:rPr>
+          <w:sz w:val="28"/>
+          <w:szCs w:val="28"/>
+        </w:rPr>
+        <w:t xml:space="preserve">CI </w:t>
+      </w:r>
+    </w:p>
+    <w:p>
+      <w:pPr>
+        <w:numPr>
+          <w:ilvl w:val="0"/>
+          <w:numId w:val="4"/>
+        </w:numPr>
+        <w:spacing w:after="0" w:line="240" w:lineRule="auto"/>
+        <w:rPr>
+          <w:sz w:val="28"/>
+          <w:szCs w:val="28"/>
+        </w:rPr>
+      </w:pPr>
+      <w:r>
+        <w:rPr>
+          <w:sz w:val="28"/>
+          <w:szCs w:val="28"/>
+        </w:rPr>
+        <w:t xml:space="preserve">Base architecture </w:t>
+      </w:r>
+    </w:p>
+    <w:p>
+      <w:pPr>
+        <w:spacing w:after="0" w:line="240" w:lineRule="auto"/>
+        <w:rPr>
+          <w:b/>
+          <w:bCs/>
+          <w:sz w:val="28"/>
+          <w:szCs w:val="28"/>
+        </w:rPr>
+      </w:pPr>
+      <w:r>
+        <w:rPr>
+          <w:b/>
+          <w:bCs/>
+          <w:sz w:val="28"/>
+          <w:szCs w:val="28"/>
+        </w:rPr>
+        <w:t>Sprint 2</w:t>
+      </w:r>
+    </w:p>
+    <w:p>
+      <w:pPr>
+        <w:numPr>
+          <w:ilvl w:val="0"/>
+          <w:numId w:val="5"/>
+        </w:numPr>
+        <w:spacing w:after="0" w:line="240" w:lineRule="auto"/>
+        <w:rPr>
+          <w:sz w:val="28"/>
+          <w:szCs w:val="28"/>
+        </w:rPr>
+      </w:pPr>
+      <w:r>
+        <w:rPr>
+          <w:sz w:val="28"/>
+          <w:szCs w:val="28"/>
+        </w:rPr>
+        <w:t xml:space="preserve">Dataset loading </w:t>
+      </w:r>
+    </w:p>
+    <w:p>
+      <w:pPr>
+        <w:numPr>
+          <w:ilvl w:val="0"/>
+          <w:numId w:val="5"/>
+        </w:numPr>
+        <w:spacing w:after="0" w:line="240" w:lineRule="auto"/>
+        <w:rPr>
+          <w:sz w:val="28"/>
+          <w:szCs w:val="28"/>
+        </w:rPr>
+      </w:pPr>
+      <w:r>
+        <w:rPr>
+          <w:sz w:val="28"/>
+          <w:szCs w:val="28"/>
+        </w:rPr>
+        <w:t xml:space="preserve">Validation </w:t>
+      </w:r>
+    </w:p>
+    <w:p>
+      <w:pPr>
+        <w:numPr>
+          <w:ilvl w:val="0"/>
+          <w:numId w:val="5"/>
+        </w:numPr>
+        <w:spacing w:after="0" w:line="240" w:lineRule="auto"/>
+        <w:rPr>
+          <w:sz w:val="28"/>
+          <w:szCs w:val="28"/>
+        </w:rPr>
+      </w:pPr>
+      <w:r>
+        <w:rPr>
+          <w:sz w:val="28"/>
+          <w:szCs w:val="28"/>
+        </w:rPr>
+        <w:t xml:space="preserve">Missing-data engine </w:t>
+      </w:r>
+    </w:p>
+    <w:p>
+      <w:pPr>
+        <w:numPr>
+          <w:ilvl w:val="0"/>
+          <w:numId w:val="5"/>
+        </w:numPr>
+        <w:spacing w:after="0" w:line="240" w:lineRule="auto"/>
+        <w:rPr>
+          <w:sz w:val="28"/>
+          <w:szCs w:val="28"/>
+        </w:rPr>
+      </w:pPr>
+      <w:r>
+        <w:rPr>
+          <w:sz w:val="28"/>
+          <w:szCs w:val="28"/>
+        </w:rPr>
+        <w:t xml:space="preserve">Frequency detection </w:t>
+      </w:r>
+    </w:p>
+    <w:p>
+      <w:pPr>
+        <w:numPr>
+          <w:ilvl w:val="0"/>
+          <w:numId w:val="5"/>
+        </w:numPr>
+        <w:spacing w:after="0" w:line="240" w:lineRule="auto"/>
+        <w:rPr>
+          <w:sz w:val="28"/>
+          <w:szCs w:val="28"/>
+        </w:rPr>
+      </w:pPr>
+      <w:r>
+        <w:rPr>
+          <w:sz w:val="28"/>
+          <w:szCs w:val="28"/>
+        </w:rPr>
+        <w:t xml:space="preserve">Diagnostics </w:t>
+      </w:r>
+    </w:p>
+    <w:p>
+      <w:pPr>
+        <w:spacing w:after="0" w:line="240" w:lineRule="auto"/>
+        <w:rPr>
+          <w:b/>
+          <w:bCs/>
+          <w:sz w:val="28"/>
+          <w:szCs w:val="28"/>
+        </w:rPr>
+      </w:pPr>
+      <w:r>
+        <w:rPr>
+          <w:b/>
+          <w:bCs/>
+          <w:sz w:val="28"/>
+          <w:szCs w:val="28"/>
+        </w:rPr>
+        <w:t>Sprint 3</w:t>
+      </w:r>
+    </w:p>
+    <w:p>
+      <w:pPr>
+        <w:numPr>
+          <w:ilvl w:val="0"/>
+          <w:numId w:val="6"/>
+        </w:numPr>
+        <w:spacing w:after="0" w:line="240" w:lineRule="auto"/>
+        <w:rPr>
+          <w:sz w:val="28"/>
+          <w:szCs w:val="28"/>
+        </w:rPr>
+      </w:pPr>
+      <w:r>
+        <w:rPr>
+          <w:sz w:val="28"/>
+          <w:szCs w:val="28"/>
+        </w:rPr>
+        <w:t xml:space="preserve">Resampling </w:t>
+      </w:r>
+    </w:p>
+    <w:p>
+      <w:pPr>
+        <w:numPr>
+          <w:ilvl w:val="0"/>
+          <w:numId w:val="6"/>
+        </w:numPr>
+        <w:spacing w:after="0" w:line="240" w:lineRule="auto"/>
+        <w:rPr>
+          <w:sz w:val="28"/>
+          <w:szCs w:val="28"/>
+        </w:rPr>
+      </w:pPr>
+      <w:r>
+        <w:rPr>
+          <w:sz w:val="28"/>
+          <w:szCs w:val="28"/>
+        </w:rPr>
+        <w:t xml:space="preserve">Feature engineering </w:t>
+      </w:r>
+    </w:p>
+    <w:p>
+      <w:pPr>
+        <w:numPr>
+          <w:ilvl w:val="0"/>
+          <w:numId w:val="6"/>
+        </w:numPr>
+        <w:spacing w:after="0" w:line="240" w:lineRule="auto"/>
+        <w:rPr>
+          <w:sz w:val="28"/>
+          <w:szCs w:val="28"/>
+        </w:rPr>
+      </w:pPr>
+      <w:r>
+        <w:rPr>
+          <w:sz w:val="28"/>
+          <w:szCs w:val="28"/>
+        </w:rPr>
+        <w:t xml:space="preserve">Visualization </w:t>
+      </w:r>
+    </w:p>
+    <w:p>
+      <w:pPr>
+        <w:numPr>
+          <w:ilvl w:val="0"/>
+          <w:numId w:val="6"/>
+        </w:numPr>
+        <w:spacing w:after="0" w:line="240" w:lineRule="auto"/>
+        <w:rPr>
+          <w:sz w:val="28"/>
+          <w:szCs w:val="28"/>
+        </w:rPr>
+      </w:pPr>
+      <w:r>
+        <w:rPr>
+          <w:sz w:val="28"/>
+          <w:szCs w:val="28"/>
+        </w:rPr>
+        <w:t xml:space="preserve">Rolling windows </w:t>
+      </w:r>
+    </w:p>
+    <w:p>
+      <w:pPr>
+        <w:numPr>
+          <w:ilvl w:val="0"/>
+          <w:numId w:val="6"/>
+        </w:numPr>
+        <w:spacing w:after="0" w:line="240" w:lineRule="auto"/>
+        <w:rPr>
+          <w:sz w:val="28"/>
+          <w:szCs w:val="28"/>
+        </w:rPr>
+      </w:pPr>
+      <w:r>
+        <w:rPr>
+          <w:b/>
+          <w:bCs/>
+          <w:sz w:val="28"/>
+          <w:szCs w:val="28"/>
+        </w:rPr>
+        <w:t>Battery Analysis Report</w:t>
+      </w:r>
+      <w:r>
+        <w:rPr>
+          <w:sz w:val="28"/>
+          <w:szCs w:val="28"/>
+        </w:rPr>
+        <w:t xml:space="preserve"> </w:t>
+      </w:r>
+    </w:p>
+    <w:p>
+      <w:pPr>
+        <w:spacing w:after="0" w:line="240" w:lineRule="auto"/>
+        <w:rPr>
+          <w:b/>
+          <w:bCs/>
+          <w:sz w:val="28"/>
+          <w:szCs w:val="28"/>
+        </w:rPr>
+      </w:pPr>
+      <w:r>
+        <w:rPr>
+          <w:b/>
+          <w:bCs/>
+          <w:sz w:val="28"/>
+          <w:szCs w:val="28"/>
+        </w:rPr>
+        <w:t>Sprint 4</w:t>
+      </w:r>
+    </w:p>
+    <w:p>
+      <w:pPr>
+        <w:numPr>
+          <w:ilvl w:val="0"/>
+          <w:numId w:val="7"/>
+        </w:numPr>
+        <w:spacing w:after="0" w:line="240" w:lineRule="auto"/>
+        <w:rPr>
+          <w:sz w:val="28"/>
+          <w:szCs w:val="28"/>
+        </w:rPr>
+      </w:pPr>
+      <w:r>
+        <w:rPr>
+          <w:sz w:val="28"/>
+          <w:szCs w:val="28"/>
+        </w:rPr>
+        <w:t xml:space="preserve">Configuration system </w:t>
+      </w:r>
+    </w:p>
+    <w:p>
+      <w:pPr>
+        <w:numPr>
+          <w:ilvl w:val="0"/>
+          <w:numId w:val="7"/>
+        </w:numPr>
+        <w:spacing w:after="0" w:line="240" w:lineRule="auto"/>
+        <w:rPr>
+          <w:sz w:val="28"/>
+          <w:szCs w:val="28"/>
+        </w:rPr>
+      </w:pPr>
+      <w:r>
+        <w:rPr>
+          <w:sz w:val="28"/>
+          <w:szCs w:val="28"/>
+        </w:rPr>
+        <w:t xml:space="preserve">Logging system </w:t>
+      </w:r>
+    </w:p>
+    <w:p>
+      <w:pPr>
+        <w:numPr>
+          <w:ilvl w:val="0"/>
+          <w:numId w:val="7"/>
+        </w:numPr>
+        <w:spacing w:after="0" w:line="240" w:lineRule="auto"/>
+        <w:rPr>
+          <w:sz w:val="28"/>
+          <w:szCs w:val="28"/>
+        </w:rPr>
+      </w:pPr>
+      <w:r>
+        <w:rPr>
+          <w:sz w:val="28"/>
+          <w:szCs w:val="28"/>
+        </w:rPr>
+        <w:t xml:space="preserve">Forecast pipeline </w:t>
+      </w:r>
+    </w:p>
+    <w:p>
+      <w:pPr>
+        <w:numPr>
+          <w:ilvl w:val="0"/>
+          <w:numId w:val="7"/>
+        </w:numPr>
+        <w:spacing w:after="0" w:line="240" w:lineRule="auto"/>
+        <w:rPr>
+          <w:sz w:val="28"/>
+          <w:szCs w:val="28"/>
+        </w:rPr>
+      </w:pPr>
+      <w:r>
+        <w:rPr>
+          <w:sz w:val="28"/>
+          <w:szCs w:val="28"/>
+        </w:rPr>
+        <w:t xml:space="preserve">ARIMA </w:t>
+      </w:r>
+    </w:p>
+    <w:p>
+      <w:pPr>
+        <w:numPr>
+          <w:ilvl w:val="0"/>
+          <w:numId w:val="7"/>
+        </w:numPr>
+        <w:spacing w:after="0" w:line="240" w:lineRule="auto"/>
+        <w:rPr>
+          <w:sz w:val="28"/>
+          <w:szCs w:val="28"/>
+        </w:rPr>
+      </w:pPr>
+      <w:r>
+        <w:rPr>
+          <w:sz w:val="28"/>
+          <w:szCs w:val="28"/>
+        </w:rPr>
+        <w:t xml:space="preserve">Kalman </w:t>
+      </w:r>
+    </w:p>
+    <w:p>
+      <w:pPr>
+        <w:spacing w:after="0" w:line="240" w:lineRule="auto"/>
+        <w:rPr>
+          <w:b/>
+          <w:bCs/>
+          <w:sz w:val="28"/>
+          <w:szCs w:val="28"/>
+        </w:rPr>
+      </w:pPr>
+      <w:r>
+        <w:rPr>
+          <w:b/>
+          <w:bCs/>
+          <w:sz w:val="28"/>
+          <w:szCs w:val="28"/>
+        </w:rPr>
+        <w:t>Sprint 5</w:t>
+      </w:r>
+    </w:p>
+    <w:p>
+      <w:pPr>
+        <w:numPr>
+          <w:ilvl w:val="0"/>
+          <w:numId w:val="8"/>
+        </w:numPr>
+        <w:spacing w:after="0" w:line="240" w:lineRule="auto"/>
+        <w:rPr>
+          <w:sz w:val="28"/>
+          <w:szCs w:val="28"/>
+        </w:rPr>
+      </w:pPr>
+      <w:r>
+        <w:rPr>
+          <w:sz w:val="28"/>
+          <w:szCs w:val="28"/>
+        </w:rPr>
+        <w:t xml:space="preserve">GRU </w:t>
+      </w:r>
+    </w:p>
+    <w:p>
+      <w:pPr>
+        <w:numPr>
+          <w:ilvl w:val="0"/>
+          <w:numId w:val="8"/>
+        </w:numPr>
+        <w:spacing w:after="0" w:line="240" w:lineRule="auto"/>
+        <w:rPr>
+          <w:sz w:val="28"/>
+          <w:szCs w:val="28"/>
+        </w:rPr>
+      </w:pPr>
+      <w:r>
+        <w:rPr>
+          <w:sz w:val="28"/>
+          <w:szCs w:val="28"/>
+        </w:rPr>
+        <w:t xml:space="preserve">LSTM </w:t>
+      </w:r>
+    </w:p>
+    <w:p>
+      <w:pPr>
+        <w:numPr>
+          <w:ilvl w:val="0"/>
+          <w:numId w:val="8"/>
+        </w:numPr>
+        <w:spacing w:after="0" w:line="240" w:lineRule="auto"/>
+        <w:rPr>
+          <w:sz w:val="28"/>
+          <w:szCs w:val="28"/>
+        </w:rPr>
+      </w:pPr>
+      <w:r>
+        <w:rPr>
+          <w:sz w:val="28"/>
+          <w:szCs w:val="28"/>
+        </w:rPr>
+        <w:t xml:space="preserve">Hybrid models </w:t>
+      </w:r>
+    </w:p>
+    <w:p>
+      <w:pPr>
+        <w:numPr>
+          <w:ilvl w:val="0"/>
+          <w:numId w:val="8"/>
+        </w:numPr>
+        <w:spacing w:after="0" w:line="240" w:lineRule="auto"/>
+        <w:rPr>
+          <w:sz w:val="28"/>
+          <w:szCs w:val="28"/>
+        </w:rPr>
+      </w:pPr>
+      <w:r>
+        <w:rPr>
+          <w:sz w:val="28"/>
+          <w:szCs w:val="28"/>
+        </w:rPr>
+        <w:t xml:space="preserve">Bayesian optimization </w:t>
+      </w:r>
+    </w:p>
+    <w:p>
+      <w:pPr>
+        <w:spacing w:after="0" w:line="240" w:lineRule="auto"/>
+        <w:rPr>
+          <w:b/>
+          <w:bCs/>
+          <w:sz w:val="28"/>
+          <w:szCs w:val="28"/>
+        </w:rPr>
+      </w:pPr>
+      <w:r>
+        <w:rPr>
+          <w:b/>
+          <w:bCs/>
+          <w:sz w:val="28"/>
+          <w:szCs w:val="28"/>
+        </w:rPr>
+        <w:t>Sprint 6</w:t>
+      </w:r>
+    </w:p>
+    <w:p>
+      <w:pPr>
+        <w:numPr>
+          <w:ilvl w:val="0"/>
+          <w:numId w:val="9"/>
+        </w:numPr>
+        <w:spacing w:after="0" w:line="240" w:lineRule="auto"/>
+        <w:rPr>
+          <w:sz w:val="28"/>
+          <w:szCs w:val="28"/>
+        </w:rPr>
+      </w:pPr>
+      <w:r>
+        <w:rPr>
+          <w:sz w:val="28"/>
+          <w:szCs w:val="28"/>
+        </w:rPr>
+        <w:t xml:space="preserve">RUL estimation </w:t>
+      </w:r>
+    </w:p>
+    <w:p>
+      <w:pPr>
+        <w:numPr>
+          <w:ilvl w:val="0"/>
+          <w:numId w:val="9"/>
+        </w:numPr>
+        <w:spacing w:after="0" w:line="240" w:lineRule="auto"/>
+        <w:rPr>
+          <w:sz w:val="28"/>
+          <w:szCs w:val="28"/>
+        </w:rPr>
+      </w:pPr>
+      <w:r>
+        <w:rPr>
+          <w:sz w:val="28"/>
+          <w:szCs w:val="28"/>
+        </w:rPr>
+        <w:t xml:space="preserve">Monte Carlo simulation </w:t>
+      </w:r>
+    </w:p>
+    <w:p>
+      <w:pPr>
+        <w:numPr>
+          <w:ilvl w:val="0"/>
+          <w:numId w:val="9"/>
+        </w:numPr>
+        <w:spacing w:after="0" w:line="240" w:lineRule="auto"/>
+        <w:rPr>
+          <w:sz w:val="28"/>
+          <w:szCs w:val="28"/>
+        </w:rPr>
+      </w:pPr>
+      <w:r>
+        <w:rPr>
+          <w:sz w:val="28"/>
+          <w:szCs w:val="28"/>
+        </w:rPr>
+        <w:t xml:space="preserve">Dashboard </w:t>
+      </w:r>
+    </w:p>
+    <w:p>
+      <w:pPr>
+        <w:numPr>
+          <w:ilvl w:val="0"/>
+          <w:numId w:val="9"/>
+        </w:numPr>
+        <w:spacing w:after="0" w:line="240" w:lineRule="auto"/>
+        <w:rPr>
+          <w:sz w:val="28"/>
+          <w:szCs w:val="28"/>
+        </w:rPr>
+      </w:pPr>
+      <w:r>
+        <w:rPr>
+          <w:sz w:val="28"/>
+          <w:szCs w:val="28"/>
+        </w:rPr>
+        <w:t xml:space="preserve">Scientific reporting </w:t>
+      </w:r>
+    </w:p>
+    <w:p>
+      <w:pPr>
+        <w:numPr>
+          <w:ilvl w:val="0"/>
+          <w:numId w:val="9"/>
+        </w:numPr>
+        <w:spacing w:after="0" w:line="240" w:lineRule="auto"/>
+        <w:rPr>
+          <w:sz w:val="28"/>
+          <w:szCs w:val="28"/>
+        </w:rPr>
+      </w:pPr>
+      <w:r>
+        <w:rPr>
+          <w:sz w:val="28"/>
+          <w:szCs w:val="28"/>
+        </w:rPr>
+        <w:t>Version 1.0</w:t>
+      </w:r>
     </w:p>
     <w:p>
       <w:pPr>
@@ -4268,6 +5202,304 @@
 <file path=word/numbering.xml><?xml version="1.0" encoding="utf-8"?>
 <w:numbering xmlns:wpc="http://schemas.microsoft.com/office/word/2010/wordprocessingCanvas" xmlns:cx="http://schemas.microsoft.com/office/drawing/2014/chartex" xmlns:cx1="http://schemas.microsoft.com/office/drawing/2015/9/8/chartex" xmlns:cx2="http://schemas.microsoft.com/office/drawing/2015/10/21/chartex" xmlns:cx3="http://schemas.microsoft.com/office/drawing/2016/5/9/chartex" xmlns:cx4="http://schemas.microsoft.com/office/drawing/2016/5/10/chartex" xmlns:cx5="http://schemas.microsoft.com/office/drawing/2016/5/11/chartex" xmlns:cx6="http://schemas.microsoft.com/office/drawing/2016/5/12/chartex" xmlns:cx7="http://schemas.microsoft.com/office/drawing/2016/5/13/chartex" xmlns:cx8="http://schemas.microsoft.com/office/drawing/2016/5/14/chartex" xmlns:mc="http://schemas.openxmlformats.org/markup-compatibility/2006" xmlns:aink="http://schemas.microsoft.com/office/drawing/2016/ink" xmlns:am3d="http://schemas.microsoft.com/office/drawing/2017/model3d" xmlns:o="urn:schemas-microsoft-com:office:office" xmlns:oel="http://schemas.microsoft.com/office/2019/extlst" xmlns:r="http://schemas.openxmlformats.org/officeDocument/2006/relationships" xmlns:m="http://schemas.openxmlformats.org/officeDocument/2006/math" xmlns:v="urn:schemas-microsoft-com:vml" xmlns:wp14="http://schemas.microsoft.com/office/word/2010/wordprocessingDrawing" xmlns:wp="http://schemas.openxmlformats.org/drawingml/2006/wordprocessingDrawing" xmlns:w10="urn:schemas-microsoft-com:office:word" xmlns:w="http://schemas.openxmlformats.org/wordprocessingml/2006/main" xmlns:w14="http://schemas.microsoft.com/office/word/2010/wordml" xmlns:w15="http://schemas.microsoft.com/office/word/2012/wordml" xmlns:w16cex="http://schemas.microsoft.com/office/word/2018/wordml/cex" xmlns:w16cid="http://schemas.microsoft.com/office/word/2016/wordml/cid" xmlns:w16="http://schemas.microsoft.com/office/word/2018/wordml" xmlns:w16du="http://schemas.microsoft.com/office/word/2023/wordml/word16du" xmlns:w16sdtdh="http://schemas.microsoft.com/office/word/2020/wordml/sdtdatahash" xmlns:w16sdtfl="http://schemas.microsoft.com/office/word/2024/wordml/sdtformatlock" xmlns:w16se="http://schemas.microsoft.com/office/word/2015/wordml/symex" xmlns:wpg="http://schemas.microsoft.com/office/word/2010/wordprocessingGroup" xmlns:wpi="http://schemas.microsoft.com/office/word/2010/wordprocessingInk" xmlns:wne="http://schemas.microsoft.com/office/word/2006/wordml" xmlns:wps="http://schemas.microsoft.com/office/word/2010/wordprocessingShape" mc:Ignorable="w14 w15 w16se w16cid w16 w16cex w16sdtdh w16sdtfl w16du wp14">
   <w:abstractNum w:abstractNumId="0" w15:restartNumberingAfterBreak="0">
+    <w:nsid w:val="000E40F9"/>
+    <w:multiLevelType w:val="multilevel"/>
+    <w:tmpl w:val="B31A72C4"/>
+    <w:lvl w:ilvl="0">
+      <w:start w:val="1"/>
+      <w:numFmt w:val="bullet"/>
+      <w:lvlText w:val=""/>
+      <w:lvlJc w:val="left"/>
+      <w:pPr>
+        <w:tabs>
+          <w:tab w:val="num" w:pos="720"/>
+        </w:tabs>
+        <w:ind w:left="720" w:hanging="360"/>
+      </w:pPr>
+      <w:rPr>
+        <w:rFonts w:ascii="Symbol" w:hAnsi="Symbol" w:hint="default"/>
+        <w:sz w:val="20"/>
+      </w:rPr>
+    </w:lvl>
+    <w:lvl w:ilvl="1" w:tentative="1">
+      <w:start w:val="1"/>
+      <w:numFmt w:val="bullet"/>
+      <w:lvlText w:val="o"/>
+      <w:lvlJc w:val="left"/>
+      <w:pPr>
+        <w:tabs>
+          <w:tab w:val="num" w:pos="1440"/>
+        </w:tabs>
+        <w:ind w:left="1440" w:hanging="360"/>
+      </w:pPr>
+      <w:rPr>
+        <w:rFonts w:ascii="Courier New" w:hAnsi="Courier New" w:hint="default"/>
+        <w:sz w:val="20"/>
+      </w:rPr>
+    </w:lvl>
+    <w:lvl w:ilvl="2" w:tentative="1">
+      <w:start w:val="1"/>
+      <w:numFmt w:val="bullet"/>
+      <w:lvlText w:val=""/>
+      <w:lvlJc w:val="left"/>
+      <w:pPr>
+        <w:tabs>
+          <w:tab w:val="num" w:pos="2160"/>
+        </w:tabs>
+        <w:ind w:left="2160" w:hanging="360"/>
+      </w:pPr>
+      <w:rPr>
+        <w:rFonts w:ascii="Wingdings" w:hAnsi="Wingdings" w:hint="default"/>
+        <w:sz w:val="20"/>
+      </w:rPr>
+    </w:lvl>
+    <w:lvl w:ilvl="3" w:tentative="1">
+      <w:start w:val="1"/>
+      <w:numFmt w:val="bullet"/>
+      <w:lvlText w:val=""/>
+      <w:lvlJc w:val="left"/>
+      <w:pPr>
+        <w:tabs>
+          <w:tab w:val="num" w:pos="2880"/>
+        </w:tabs>
+        <w:ind w:left="2880" w:hanging="360"/>
+      </w:pPr>
+      <w:rPr>
+        <w:rFonts w:ascii="Wingdings" w:hAnsi="Wingdings" w:hint="default"/>
+        <w:sz w:val="20"/>
+      </w:rPr>
+    </w:lvl>
+    <w:lvl w:ilvl="4" w:tentative="1">
+      <w:start w:val="1"/>
+      <w:numFmt w:val="bullet"/>
+      <w:lvlText w:val=""/>
+      <w:lvlJc w:val="left"/>
+      <w:pPr>
+        <w:tabs>
+          <w:tab w:val="num" w:pos="3600"/>
+        </w:tabs>
+        <w:ind w:left="3600" w:hanging="360"/>
+      </w:pPr>
+      <w:rPr>
+        <w:rFonts w:ascii="Wingdings" w:hAnsi="Wingdings" w:hint="default"/>
+        <w:sz w:val="20"/>
+      </w:rPr>
+    </w:lvl>
+    <w:lvl w:ilvl="5" w:tentative="1">
+      <w:start w:val="1"/>
+      <w:numFmt w:val="bullet"/>
+      <w:lvlText w:val=""/>
+      <w:lvlJc w:val="left"/>
+      <w:pPr>
+        <w:tabs>
+          <w:tab w:val="num" w:pos="4320"/>
+        </w:tabs>
+        <w:ind w:left="4320" w:hanging="360"/>
+      </w:pPr>
+      <w:rPr>
+        <w:rFonts w:ascii="Wingdings" w:hAnsi="Wingdings" w:hint="default"/>
+        <w:sz w:val="20"/>
+      </w:rPr>
+    </w:lvl>
+    <w:lvl w:ilvl="6" w:tentative="1">
+      <w:start w:val="1"/>
+      <w:numFmt w:val="bullet"/>
+      <w:lvlText w:val=""/>
+      <w:lvlJc w:val="left"/>
+      <w:pPr>
+        <w:tabs>
+          <w:tab w:val="num" w:pos="5040"/>
+        </w:tabs>
+        <w:ind w:left="5040" w:hanging="360"/>
+      </w:pPr>
+      <w:rPr>
+        <w:rFonts w:ascii="Wingdings" w:hAnsi="Wingdings" w:hint="default"/>
+        <w:sz w:val="20"/>
+      </w:rPr>
+    </w:lvl>
+    <w:lvl w:ilvl="7" w:tentative="1">
+      <w:start w:val="1"/>
+      <w:numFmt w:val="bullet"/>
+      <w:lvlText w:val=""/>
+      <w:lvlJc w:val="left"/>
+      <w:pPr>
+        <w:tabs>
+          <w:tab w:val="num" w:pos="5760"/>
+        </w:tabs>
+        <w:ind w:left="5760" w:hanging="360"/>
+      </w:pPr>
+      <w:rPr>
+        <w:rFonts w:ascii="Wingdings" w:hAnsi="Wingdings" w:hint="default"/>
+        <w:sz w:val="20"/>
+      </w:rPr>
+    </w:lvl>
+    <w:lvl w:ilvl="8" w:tentative="1">
+      <w:start w:val="1"/>
+      <w:numFmt w:val="bullet"/>
+      <w:lvlText w:val=""/>
+      <w:lvlJc w:val="left"/>
+      <w:pPr>
+        <w:tabs>
+          <w:tab w:val="num" w:pos="6480"/>
+        </w:tabs>
+        <w:ind w:left="6480" w:hanging="360"/>
+      </w:pPr>
+      <w:rPr>
+        <w:rFonts w:ascii="Wingdings" w:hAnsi="Wingdings" w:hint="default"/>
+        <w:sz w:val="20"/>
+      </w:rPr>
+    </w:lvl>
+  </w:abstractNum>
+  <w:abstractNum w:abstractNumId="1" w15:restartNumberingAfterBreak="0">
+    <w:nsid w:val="26B647B2"/>
+    <w:multiLevelType w:val="multilevel"/>
+    <w:tmpl w:val="8342140A"/>
+    <w:lvl w:ilvl="0">
+      <w:start w:val="1"/>
+      <w:numFmt w:val="bullet"/>
+      <w:lvlText w:val=""/>
+      <w:lvlJc w:val="left"/>
+      <w:pPr>
+        <w:tabs>
+          <w:tab w:val="num" w:pos="720"/>
+        </w:tabs>
+        <w:ind w:left="720" w:hanging="360"/>
+      </w:pPr>
+      <w:rPr>
+        <w:rFonts w:ascii="Symbol" w:hAnsi="Symbol" w:hint="default"/>
+        <w:sz w:val="20"/>
+      </w:rPr>
+    </w:lvl>
+    <w:lvl w:ilvl="1" w:tentative="1">
+      <w:start w:val="1"/>
+      <w:numFmt w:val="bullet"/>
+      <w:lvlText w:val="o"/>
+      <w:lvlJc w:val="left"/>
+      <w:pPr>
+        <w:tabs>
+          <w:tab w:val="num" w:pos="1440"/>
+        </w:tabs>
+        <w:ind w:left="1440" w:hanging="360"/>
+      </w:pPr>
+      <w:rPr>
+        <w:rFonts w:ascii="Courier New" w:hAnsi="Courier New" w:hint="default"/>
+        <w:sz w:val="20"/>
+      </w:rPr>
+    </w:lvl>
+    <w:lvl w:ilvl="2" w:tentative="1">
+      <w:start w:val="1"/>
+      <w:numFmt w:val="bullet"/>
+      <w:lvlText w:val=""/>
+      <w:lvlJc w:val="left"/>
+      <w:pPr>
+        <w:tabs>
+          <w:tab w:val="num" w:pos="2160"/>
+        </w:tabs>
+        <w:ind w:left="2160" w:hanging="360"/>
+      </w:pPr>
+      <w:rPr>
+        <w:rFonts w:ascii="Wingdings" w:hAnsi="Wingdings" w:hint="default"/>
+        <w:sz w:val="20"/>
+      </w:rPr>
+    </w:lvl>
+    <w:lvl w:ilvl="3" w:tentative="1">
+      <w:start w:val="1"/>
+      <w:numFmt w:val="bullet"/>
+      <w:lvlText w:val=""/>
+      <w:lvlJc w:val="left"/>
+      <w:pPr>
+        <w:tabs>
+          <w:tab w:val="num" w:pos="2880"/>
+        </w:tabs>
+        <w:ind w:left="2880" w:hanging="360"/>
+      </w:pPr>
+      <w:rPr>
+        <w:rFonts w:ascii="Wingdings" w:hAnsi="Wingdings" w:hint="default"/>
+        <w:sz w:val="20"/>
+      </w:rPr>
+    </w:lvl>
+    <w:lvl w:ilvl="4" w:tentative="1">
+      <w:start w:val="1"/>
+      <w:numFmt w:val="bullet"/>
+      <w:lvlText w:val=""/>
+      <w:lvlJc w:val="left"/>
+      <w:pPr>
+        <w:tabs>
+          <w:tab w:val="num" w:pos="3600"/>
+        </w:tabs>
+        <w:ind w:left="3600" w:hanging="360"/>
+      </w:pPr>
+      <w:rPr>
+        <w:rFonts w:ascii="Wingdings" w:hAnsi="Wingdings" w:hint="default"/>
+        <w:sz w:val="20"/>
+      </w:rPr>
+    </w:lvl>
+    <w:lvl w:ilvl="5" w:tentative="1">
+      <w:start w:val="1"/>
+      <w:numFmt w:val="bullet"/>
+      <w:lvlText w:val=""/>
+      <w:lvlJc w:val="left"/>
+      <w:pPr>
+        <w:tabs>
+          <w:tab w:val="num" w:pos="4320"/>
+        </w:tabs>
+        <w:ind w:left="4320" w:hanging="360"/>
+      </w:pPr>
+      <w:rPr>
+        <w:rFonts w:ascii="Wingdings" w:hAnsi="Wingdings" w:hint="default"/>
+        <w:sz w:val="20"/>
+      </w:rPr>
+    </w:lvl>
+    <w:lvl w:ilvl="6" w:tentative="1">
+      <w:start w:val="1"/>
+      <w:numFmt w:val="bullet"/>
+      <w:lvlText w:val=""/>
+      <w:lvlJc w:val="left"/>
+      <w:pPr>
+        <w:tabs>
+          <w:tab w:val="num" w:pos="5040"/>
+        </w:tabs>
+        <w:ind w:left="5040" w:hanging="360"/>
+      </w:pPr>
+      <w:rPr>
+        <w:rFonts w:ascii="Wingdings" w:hAnsi="Wingdings" w:hint="default"/>
+        <w:sz w:val="20"/>
+      </w:rPr>
+    </w:lvl>
+    <w:lvl w:ilvl="7" w:tentative="1">
+      <w:start w:val="1"/>
+      <w:numFmt w:val="bullet"/>
+      <w:lvlText w:val=""/>
+      <w:lvlJc w:val="left"/>
+      <w:pPr>
+        <w:tabs>
+          <w:tab w:val="num" w:pos="5760"/>
+        </w:tabs>
+        <w:ind w:left="5760" w:hanging="360"/>
+      </w:pPr>
+      <w:rPr>
+        <w:rFonts w:ascii="Wingdings" w:hAnsi="Wingdings" w:hint="default"/>
+        <w:sz w:val="20"/>
+      </w:rPr>
+    </w:lvl>
+    <w:lvl w:ilvl="8" w:tentative="1">
+      <w:start w:val="1"/>
+      <w:numFmt w:val="bullet"/>
+      <w:lvlText w:val=""/>
+      <w:lvlJc w:val="left"/>
+      <w:pPr>
+        <w:tabs>
+          <w:tab w:val="num" w:pos="6480"/>
+        </w:tabs>
+        <w:ind w:left="6480" w:hanging="360"/>
+      </w:pPr>
+      <w:rPr>
+        <w:rFonts w:ascii="Wingdings" w:hAnsi="Wingdings" w:hint="default"/>
+        <w:sz w:val="20"/>
+      </w:rPr>
+    </w:lvl>
+  </w:abstractNum>
+  <w:abstractNum w:abstractNumId="2" w15:restartNumberingAfterBreak="0">
     <w:nsid w:val="320E0B82"/>
     <w:multiLevelType w:val="multilevel"/>
     <w:tmpl w:val="67A0C5AE"/>
@@ -4416,7 +5648,454 @@
       </w:rPr>
     </w:lvl>
   </w:abstractNum>
-  <w:abstractNum w:abstractNumId="1" w15:restartNumberingAfterBreak="0">
+  <w:abstractNum w:abstractNumId="3" w15:restartNumberingAfterBreak="0">
+    <w:nsid w:val="3DB2253E"/>
+    <w:multiLevelType w:val="multilevel"/>
+    <w:tmpl w:val="F1E0B30A"/>
+    <w:lvl w:ilvl="0">
+      <w:start w:val="1"/>
+      <w:numFmt w:val="bullet"/>
+      <w:lvlText w:val=""/>
+      <w:lvlJc w:val="left"/>
+      <w:pPr>
+        <w:tabs>
+          <w:tab w:val="num" w:pos="720"/>
+        </w:tabs>
+        <w:ind w:left="720" w:hanging="360"/>
+      </w:pPr>
+      <w:rPr>
+        <w:rFonts w:ascii="Symbol" w:hAnsi="Symbol" w:hint="default"/>
+        <w:sz w:val="20"/>
+      </w:rPr>
+    </w:lvl>
+    <w:lvl w:ilvl="1" w:tentative="1">
+      <w:start w:val="1"/>
+      <w:numFmt w:val="bullet"/>
+      <w:lvlText w:val="o"/>
+      <w:lvlJc w:val="left"/>
+      <w:pPr>
+        <w:tabs>
+          <w:tab w:val="num" w:pos="1440"/>
+        </w:tabs>
+        <w:ind w:left="1440" w:hanging="360"/>
+      </w:pPr>
+      <w:rPr>
+        <w:rFonts w:ascii="Courier New" w:hAnsi="Courier New" w:hint="default"/>
+        <w:sz w:val="20"/>
+      </w:rPr>
+    </w:lvl>
+    <w:lvl w:ilvl="2" w:tentative="1">
+      <w:start w:val="1"/>
+      <w:numFmt w:val="bullet"/>
+      <w:lvlText w:val=""/>
+      <w:lvlJc w:val="left"/>
+      <w:pPr>
+        <w:tabs>
+          <w:tab w:val="num" w:pos="2160"/>
+        </w:tabs>
+        <w:ind w:left="2160" w:hanging="360"/>
+      </w:pPr>
+      <w:rPr>
+        <w:rFonts w:ascii="Wingdings" w:hAnsi="Wingdings" w:hint="default"/>
+        <w:sz w:val="20"/>
+      </w:rPr>
+    </w:lvl>
+    <w:lvl w:ilvl="3" w:tentative="1">
+      <w:start w:val="1"/>
+      <w:numFmt w:val="bullet"/>
+      <w:lvlText w:val=""/>
+      <w:lvlJc w:val="left"/>
+      <w:pPr>
+        <w:tabs>
+          <w:tab w:val="num" w:pos="2880"/>
+        </w:tabs>
+        <w:ind w:left="2880" w:hanging="360"/>
+      </w:pPr>
+      <w:rPr>
+        <w:rFonts w:ascii="Wingdings" w:hAnsi="Wingdings" w:hint="default"/>
+        <w:sz w:val="20"/>
+      </w:rPr>
+    </w:lvl>
+    <w:lvl w:ilvl="4" w:tentative="1">
+      <w:start w:val="1"/>
+      <w:numFmt w:val="bullet"/>
+      <w:lvlText w:val=""/>
+      <w:lvlJc w:val="left"/>
+      <w:pPr>
+        <w:tabs>
+          <w:tab w:val="num" w:pos="3600"/>
+        </w:tabs>
+        <w:ind w:left="3600" w:hanging="360"/>
+      </w:pPr>
+      <w:rPr>
+        <w:rFonts w:ascii="Wingdings" w:hAnsi="Wingdings" w:hint="default"/>
+        <w:sz w:val="20"/>
+      </w:rPr>
+    </w:lvl>
+    <w:lvl w:ilvl="5" w:tentative="1">
+      <w:start w:val="1"/>
+      <w:numFmt w:val="bullet"/>
+      <w:lvlText w:val=""/>
+      <w:lvlJc w:val="left"/>
+      <w:pPr>
+        <w:tabs>
+          <w:tab w:val="num" w:pos="4320"/>
+        </w:tabs>
+        <w:ind w:left="4320" w:hanging="360"/>
+      </w:pPr>
+      <w:rPr>
+        <w:rFonts w:ascii="Wingdings" w:hAnsi="Wingdings" w:hint="default"/>
+        <w:sz w:val="20"/>
+      </w:rPr>
+    </w:lvl>
+    <w:lvl w:ilvl="6" w:tentative="1">
+      <w:start w:val="1"/>
+      <w:numFmt w:val="bullet"/>
+      <w:lvlText w:val=""/>
+      <w:lvlJc w:val="left"/>
+      <w:pPr>
+        <w:tabs>
+          <w:tab w:val="num" w:pos="5040"/>
+        </w:tabs>
+        <w:ind w:left="5040" w:hanging="360"/>
+      </w:pPr>
+      <w:rPr>
+        <w:rFonts w:ascii="Wingdings" w:hAnsi="Wingdings" w:hint="default"/>
+        <w:sz w:val="20"/>
+      </w:rPr>
+    </w:lvl>
+    <w:lvl w:ilvl="7" w:tentative="1">
+      <w:start w:val="1"/>
+      <w:numFmt w:val="bullet"/>
+      <w:lvlText w:val=""/>
+      <w:lvlJc w:val="left"/>
+      <w:pPr>
+        <w:tabs>
+          <w:tab w:val="num" w:pos="5760"/>
+        </w:tabs>
+        <w:ind w:left="5760" w:hanging="360"/>
+      </w:pPr>
+      <w:rPr>
+        <w:rFonts w:ascii="Wingdings" w:hAnsi="Wingdings" w:hint="default"/>
+        <w:sz w:val="20"/>
+      </w:rPr>
+    </w:lvl>
+    <w:lvl w:ilvl="8" w:tentative="1">
+      <w:start w:val="1"/>
+      <w:numFmt w:val="bullet"/>
+      <w:lvlText w:val=""/>
+      <w:lvlJc w:val="left"/>
+      <w:pPr>
+        <w:tabs>
+          <w:tab w:val="num" w:pos="6480"/>
+        </w:tabs>
+        <w:ind w:left="6480" w:hanging="360"/>
+      </w:pPr>
+      <w:rPr>
+        <w:rFonts w:ascii="Wingdings" w:hAnsi="Wingdings" w:hint="default"/>
+        <w:sz w:val="20"/>
+      </w:rPr>
+    </w:lvl>
+  </w:abstractNum>
+  <w:abstractNum w:abstractNumId="4" w15:restartNumberingAfterBreak="0">
+    <w:nsid w:val="4CEF3128"/>
+    <w:multiLevelType w:val="multilevel"/>
+    <w:tmpl w:val="1DC22672"/>
+    <w:lvl w:ilvl="0">
+      <w:start w:val="1"/>
+      <w:numFmt w:val="bullet"/>
+      <w:lvlText w:val=""/>
+      <w:lvlJc w:val="left"/>
+      <w:pPr>
+        <w:tabs>
+          <w:tab w:val="num" w:pos="720"/>
+        </w:tabs>
+        <w:ind w:left="720" w:hanging="360"/>
+      </w:pPr>
+      <w:rPr>
+        <w:rFonts w:ascii="Symbol" w:hAnsi="Symbol" w:hint="default"/>
+        <w:sz w:val="20"/>
+      </w:rPr>
+    </w:lvl>
+    <w:lvl w:ilvl="1" w:tentative="1">
+      <w:start w:val="1"/>
+      <w:numFmt w:val="bullet"/>
+      <w:lvlText w:val="o"/>
+      <w:lvlJc w:val="left"/>
+      <w:pPr>
+        <w:tabs>
+          <w:tab w:val="num" w:pos="1440"/>
+        </w:tabs>
+        <w:ind w:left="1440" w:hanging="360"/>
+      </w:pPr>
+      <w:rPr>
+        <w:rFonts w:ascii="Courier New" w:hAnsi="Courier New" w:hint="default"/>
+        <w:sz w:val="20"/>
+      </w:rPr>
+    </w:lvl>
+    <w:lvl w:ilvl="2" w:tentative="1">
+      <w:start w:val="1"/>
+      <w:numFmt w:val="bullet"/>
+      <w:lvlText w:val=""/>
+      <w:lvlJc w:val="left"/>
+      <w:pPr>
+        <w:tabs>
+          <w:tab w:val="num" w:pos="2160"/>
+        </w:tabs>
+        <w:ind w:left="2160" w:hanging="360"/>
+      </w:pPr>
+      <w:rPr>
+        <w:rFonts w:ascii="Wingdings" w:hAnsi="Wingdings" w:hint="default"/>
+        <w:sz w:val="20"/>
+      </w:rPr>
+    </w:lvl>
+    <w:lvl w:ilvl="3" w:tentative="1">
+      <w:start w:val="1"/>
+      <w:numFmt w:val="bullet"/>
+      <w:lvlText w:val=""/>
+      <w:lvlJc w:val="left"/>
+      <w:pPr>
+        <w:tabs>
+          <w:tab w:val="num" w:pos="2880"/>
+        </w:tabs>
+        <w:ind w:left="2880" w:hanging="360"/>
+      </w:pPr>
+      <w:rPr>
+        <w:rFonts w:ascii="Wingdings" w:hAnsi="Wingdings" w:hint="default"/>
+        <w:sz w:val="20"/>
+      </w:rPr>
+    </w:lvl>
+    <w:lvl w:ilvl="4" w:tentative="1">
+      <w:start w:val="1"/>
+      <w:numFmt w:val="bullet"/>
+      <w:lvlText w:val=""/>
+      <w:lvlJc w:val="left"/>
+      <w:pPr>
+        <w:tabs>
+          <w:tab w:val="num" w:pos="3600"/>
+        </w:tabs>
+        <w:ind w:left="3600" w:hanging="360"/>
+      </w:pPr>
+      <w:rPr>
+        <w:rFonts w:ascii="Wingdings" w:hAnsi="Wingdings" w:hint="default"/>
+        <w:sz w:val="20"/>
+      </w:rPr>
+    </w:lvl>
+    <w:lvl w:ilvl="5" w:tentative="1">
+      <w:start w:val="1"/>
+      <w:numFmt w:val="bullet"/>
+      <w:lvlText w:val=""/>
+      <w:lvlJc w:val="left"/>
+      <w:pPr>
+        <w:tabs>
+          <w:tab w:val="num" w:pos="4320"/>
+        </w:tabs>
+        <w:ind w:left="4320" w:hanging="360"/>
+      </w:pPr>
+      <w:rPr>
+        <w:rFonts w:ascii="Wingdings" w:hAnsi="Wingdings" w:hint="default"/>
+        <w:sz w:val="20"/>
+      </w:rPr>
+    </w:lvl>
+    <w:lvl w:ilvl="6" w:tentative="1">
+      <w:start w:val="1"/>
+      <w:numFmt w:val="bullet"/>
+      <w:lvlText w:val=""/>
+      <w:lvlJc w:val="left"/>
+      <w:pPr>
+        <w:tabs>
+          <w:tab w:val="num" w:pos="5040"/>
+        </w:tabs>
+        <w:ind w:left="5040" w:hanging="360"/>
+      </w:pPr>
+      <w:rPr>
+        <w:rFonts w:ascii="Wingdings" w:hAnsi="Wingdings" w:hint="default"/>
+        <w:sz w:val="20"/>
+      </w:rPr>
+    </w:lvl>
+    <w:lvl w:ilvl="7" w:tentative="1">
+      <w:start w:val="1"/>
+      <w:numFmt w:val="bullet"/>
+      <w:lvlText w:val=""/>
+      <w:lvlJc w:val="left"/>
+      <w:pPr>
+        <w:tabs>
+          <w:tab w:val="num" w:pos="5760"/>
+        </w:tabs>
+        <w:ind w:left="5760" w:hanging="360"/>
+      </w:pPr>
+      <w:rPr>
+        <w:rFonts w:ascii="Wingdings" w:hAnsi="Wingdings" w:hint="default"/>
+        <w:sz w:val="20"/>
+      </w:rPr>
+    </w:lvl>
+    <w:lvl w:ilvl="8" w:tentative="1">
+      <w:start w:val="1"/>
+      <w:numFmt w:val="bullet"/>
+      <w:lvlText w:val=""/>
+      <w:lvlJc w:val="left"/>
+      <w:pPr>
+        <w:tabs>
+          <w:tab w:val="num" w:pos="6480"/>
+        </w:tabs>
+        <w:ind w:left="6480" w:hanging="360"/>
+      </w:pPr>
+      <w:rPr>
+        <w:rFonts w:ascii="Wingdings" w:hAnsi="Wingdings" w:hint="default"/>
+        <w:sz w:val="20"/>
+      </w:rPr>
+    </w:lvl>
+  </w:abstractNum>
+  <w:abstractNum w:abstractNumId="5" w15:restartNumberingAfterBreak="0">
+    <w:nsid w:val="5796578F"/>
+    <w:multiLevelType w:val="multilevel"/>
+    <w:tmpl w:val="970C4484"/>
+    <w:lvl w:ilvl="0">
+      <w:start w:val="1"/>
+      <w:numFmt w:val="bullet"/>
+      <w:lvlText w:val=""/>
+      <w:lvlJc w:val="left"/>
+      <w:pPr>
+        <w:tabs>
+          <w:tab w:val="num" w:pos="720"/>
+        </w:tabs>
+        <w:ind w:left="720" w:hanging="360"/>
+      </w:pPr>
+      <w:rPr>
+        <w:rFonts w:ascii="Symbol" w:hAnsi="Symbol" w:hint="default"/>
+        <w:sz w:val="20"/>
+      </w:rPr>
+    </w:lvl>
+    <w:lvl w:ilvl="1" w:tentative="1">
+      <w:start w:val="1"/>
+      <w:numFmt w:val="bullet"/>
+      <w:lvlText w:val="o"/>
+      <w:lvlJc w:val="left"/>
+      <w:pPr>
+        <w:tabs>
+          <w:tab w:val="num" w:pos="1440"/>
+        </w:tabs>
+        <w:ind w:left="1440" w:hanging="360"/>
+      </w:pPr>
+      <w:rPr>
+        <w:rFonts w:ascii="Courier New" w:hAnsi="Courier New" w:hint="default"/>
+        <w:sz w:val="20"/>
+      </w:rPr>
+    </w:lvl>
+    <w:lvl w:ilvl="2" w:tentative="1">
+      <w:start w:val="1"/>
+      <w:numFmt w:val="bullet"/>
+      <w:lvlText w:val=""/>
+      <w:lvlJc w:val="left"/>
+      <w:pPr>
+        <w:tabs>
+          <w:tab w:val="num" w:pos="2160"/>
+        </w:tabs>
+        <w:ind w:left="2160" w:hanging="360"/>
+      </w:pPr>
+      <w:rPr>
+        <w:rFonts w:ascii="Wingdings" w:hAnsi="Wingdings" w:hint="default"/>
+        <w:sz w:val="20"/>
+      </w:rPr>
+    </w:lvl>
+    <w:lvl w:ilvl="3" w:tentative="1">
+      <w:start w:val="1"/>
+      <w:numFmt w:val="bullet"/>
+      <w:lvlText w:val=""/>
+      <w:lvlJc w:val="left"/>
+      <w:pPr>
+        <w:tabs>
+          <w:tab w:val="num" w:pos="2880"/>
+        </w:tabs>
+        <w:ind w:left="2880" w:hanging="360"/>
+      </w:pPr>
+      <w:rPr>
+        <w:rFonts w:ascii="Wingdings" w:hAnsi="Wingdings" w:hint="default"/>
+        <w:sz w:val="20"/>
+      </w:rPr>
+    </w:lvl>
+    <w:lvl w:ilvl="4" w:tentative="1">
+      <w:start w:val="1"/>
+      <w:numFmt w:val="bullet"/>
+      <w:lvlText w:val=""/>
+      <w:lvlJc w:val="left"/>
+      <w:pPr>
+        <w:tabs>
+          <w:tab w:val="num" w:pos="3600"/>
+        </w:tabs>
+        <w:ind w:left="3600" w:hanging="360"/>
+      </w:pPr>
+      <w:rPr>
+        <w:rFonts w:ascii="Wingdings" w:hAnsi="Wingdings" w:hint="default"/>
+        <w:sz w:val="20"/>
+      </w:rPr>
+    </w:lvl>
+    <w:lvl w:ilvl="5" w:tentative="1">
+      <w:start w:val="1"/>
+      <w:numFmt w:val="bullet"/>
+      <w:lvlText w:val=""/>
+      <w:lvlJc w:val="left"/>
+      <w:pPr>
+        <w:tabs>
+          <w:tab w:val="num" w:pos="4320"/>
+        </w:tabs>
+        <w:ind w:left="4320" w:hanging="360"/>
+      </w:pPr>
+      <w:rPr>
+        <w:rFonts w:ascii="Wingdings" w:hAnsi="Wingdings" w:hint="default"/>
+        <w:sz w:val="20"/>
+      </w:rPr>
+    </w:lvl>
+    <w:lvl w:ilvl="6" w:tentative="1">
+      <w:start w:val="1"/>
+      <w:numFmt w:val="bullet"/>
+      <w:lvlText w:val=""/>
+      <w:lvlJc w:val="left"/>
+      <w:pPr>
+        <w:tabs>
+          <w:tab w:val="num" w:pos="5040"/>
+        </w:tabs>
+        <w:ind w:left="5040" w:hanging="360"/>
+      </w:pPr>
+      <w:rPr>
+        <w:rFonts w:ascii="Wingdings" w:hAnsi="Wingdings" w:hint="default"/>
+        <w:sz w:val="20"/>
+      </w:rPr>
+    </w:lvl>
+    <w:lvl w:ilvl="7" w:tentative="1">
+      <w:start w:val="1"/>
+      <w:numFmt w:val="bullet"/>
+      <w:lvlText w:val=""/>
+      <w:lvlJc w:val="left"/>
+      <w:pPr>
+        <w:tabs>
+          <w:tab w:val="num" w:pos="5760"/>
+        </w:tabs>
+        <w:ind w:left="5760" w:hanging="360"/>
+      </w:pPr>
+      <w:rPr>
+        <w:rFonts w:ascii="Wingdings" w:hAnsi="Wingdings" w:hint="default"/>
+        <w:sz w:val="20"/>
+      </w:rPr>
+    </w:lvl>
+    <w:lvl w:ilvl="8" w:tentative="1">
+      <w:start w:val="1"/>
+      <w:numFmt w:val="bullet"/>
+      <w:lvlText w:val=""/>
+      <w:lvlJc w:val="left"/>
+      <w:pPr>
+        <w:tabs>
+          <w:tab w:val="num" w:pos="6480"/>
+        </w:tabs>
+        <w:ind w:left="6480" w:hanging="360"/>
+      </w:pPr>
+      <w:rPr>
+        <w:rFonts w:ascii="Wingdings" w:hAnsi="Wingdings" w:hint="default"/>
+        <w:sz w:val="20"/>
+      </w:rPr>
+    </w:lvl>
+  </w:abstractNum>
+  <w:abstractNum w:abstractNumId="6" w15:restartNumberingAfterBreak="0">
     <w:nsid w:val="57AC2ADD"/>
     <w:multiLevelType w:val="multilevel"/>
     <w:tmpl w:val="1716FFEE"/>
@@ -4565,7 +6244,156 @@
       </w:rPr>
     </w:lvl>
   </w:abstractNum>
-  <w:abstractNum w:abstractNumId="2" w15:restartNumberingAfterBreak="0">
+  <w:abstractNum w:abstractNumId="7" w15:restartNumberingAfterBreak="0">
+    <w:nsid w:val="69EF507F"/>
+    <w:multiLevelType w:val="multilevel"/>
+    <w:tmpl w:val="DFAC709E"/>
+    <w:lvl w:ilvl="0">
+      <w:start w:val="1"/>
+      <w:numFmt w:val="bullet"/>
+      <w:lvlText w:val=""/>
+      <w:lvlJc w:val="left"/>
+      <w:pPr>
+        <w:tabs>
+          <w:tab w:val="num" w:pos="720"/>
+        </w:tabs>
+        <w:ind w:left="720" w:hanging="360"/>
+      </w:pPr>
+      <w:rPr>
+        <w:rFonts w:ascii="Symbol" w:hAnsi="Symbol" w:hint="default"/>
+        <w:sz w:val="20"/>
+      </w:rPr>
+    </w:lvl>
+    <w:lvl w:ilvl="1" w:tentative="1">
+      <w:start w:val="1"/>
+      <w:numFmt w:val="bullet"/>
+      <w:lvlText w:val="o"/>
+      <w:lvlJc w:val="left"/>
+      <w:pPr>
+        <w:tabs>
+          <w:tab w:val="num" w:pos="1440"/>
+        </w:tabs>
+        <w:ind w:left="1440" w:hanging="360"/>
+      </w:pPr>
+      <w:rPr>
+        <w:rFonts w:ascii="Courier New" w:hAnsi="Courier New" w:hint="default"/>
+        <w:sz w:val="20"/>
+      </w:rPr>
+    </w:lvl>
+    <w:lvl w:ilvl="2" w:tentative="1">
+      <w:start w:val="1"/>
+      <w:numFmt w:val="bullet"/>
+      <w:lvlText w:val=""/>
+      <w:lvlJc w:val="left"/>
+      <w:pPr>
+        <w:tabs>
+          <w:tab w:val="num" w:pos="2160"/>
+        </w:tabs>
+        <w:ind w:left="2160" w:hanging="360"/>
+      </w:pPr>
+      <w:rPr>
+        <w:rFonts w:ascii="Wingdings" w:hAnsi="Wingdings" w:hint="default"/>
+        <w:sz w:val="20"/>
+      </w:rPr>
+    </w:lvl>
+    <w:lvl w:ilvl="3" w:tentative="1">
+      <w:start w:val="1"/>
+      <w:numFmt w:val="bullet"/>
+      <w:lvlText w:val=""/>
+      <w:lvlJc w:val="left"/>
+      <w:pPr>
+        <w:tabs>
+          <w:tab w:val="num" w:pos="2880"/>
+        </w:tabs>
+        <w:ind w:left="2880" w:hanging="360"/>
+      </w:pPr>
+      <w:rPr>
+        <w:rFonts w:ascii="Wingdings" w:hAnsi="Wingdings" w:hint="default"/>
+        <w:sz w:val="20"/>
+      </w:rPr>
+    </w:lvl>
+    <w:lvl w:ilvl="4" w:tentative="1">
+      <w:start w:val="1"/>
+      <w:numFmt w:val="bullet"/>
+      <w:lvlText w:val=""/>
+      <w:lvlJc w:val="left"/>
+      <w:pPr>
+        <w:tabs>
+          <w:tab w:val="num" w:pos="3600"/>
+        </w:tabs>
+        <w:ind w:left="3600" w:hanging="360"/>
+      </w:pPr>
+      <w:rPr>
+        <w:rFonts w:ascii="Wingdings" w:hAnsi="Wingdings" w:hint="default"/>
+        <w:sz w:val="20"/>
+      </w:rPr>
+    </w:lvl>
+    <w:lvl w:ilvl="5" w:tentative="1">
+      <w:start w:val="1"/>
+      <w:numFmt w:val="bullet"/>
+      <w:lvlText w:val=""/>
+      <w:lvlJc w:val="left"/>
+      <w:pPr>
+        <w:tabs>
+          <w:tab w:val="num" w:pos="4320"/>
+        </w:tabs>
+        <w:ind w:left="4320" w:hanging="360"/>
+      </w:pPr>
+      <w:rPr>
+        <w:rFonts w:ascii="Wingdings" w:hAnsi="Wingdings" w:hint="default"/>
+        <w:sz w:val="20"/>
+      </w:rPr>
+    </w:lvl>
+    <w:lvl w:ilvl="6" w:tentative="1">
+      <w:start w:val="1"/>
+      <w:numFmt w:val="bullet"/>
+      <w:lvlText w:val=""/>
+      <w:lvlJc w:val="left"/>
+      <w:pPr>
+        <w:tabs>
+          <w:tab w:val="num" w:pos="5040"/>
+        </w:tabs>
+        <w:ind w:left="5040" w:hanging="360"/>
+      </w:pPr>
+      <w:rPr>
+        <w:rFonts w:ascii="Wingdings" w:hAnsi="Wingdings" w:hint="default"/>
+        <w:sz w:val="20"/>
+      </w:rPr>
+    </w:lvl>
+    <w:lvl w:ilvl="7" w:tentative="1">
+      <w:start w:val="1"/>
+      <w:numFmt w:val="bullet"/>
+      <w:lvlText w:val=""/>
+      <w:lvlJc w:val="left"/>
+      <w:pPr>
+        <w:tabs>
+          <w:tab w:val="num" w:pos="5760"/>
+        </w:tabs>
+        <w:ind w:left="5760" w:hanging="360"/>
+      </w:pPr>
+      <w:rPr>
+        <w:rFonts w:ascii="Wingdings" w:hAnsi="Wingdings" w:hint="default"/>
+        <w:sz w:val="20"/>
+      </w:rPr>
+    </w:lvl>
+    <w:lvl w:ilvl="8" w:tentative="1">
+      <w:start w:val="1"/>
+      <w:numFmt w:val="bullet"/>
+      <w:lvlText w:val=""/>
+      <w:lvlJc w:val="left"/>
+      <w:pPr>
+        <w:tabs>
+          <w:tab w:val="num" w:pos="6480"/>
+        </w:tabs>
+        <w:ind w:left="6480" w:hanging="360"/>
+      </w:pPr>
+      <w:rPr>
+        <w:rFonts w:ascii="Wingdings" w:hAnsi="Wingdings" w:hint="default"/>
+        <w:sz w:val="20"/>
+      </w:rPr>
+    </w:lvl>
+  </w:abstractNum>
+  <w:abstractNum w:abstractNumId="8" w15:restartNumberingAfterBreak="0">
     <w:nsid w:val="70007D95"/>
     <w:multiLevelType w:val="multilevel"/>
     <w:tmpl w:val="385ED098"/>
@@ -4715,13 +6543,31 @@
     </w:lvl>
   </w:abstractNum>
   <w:num w:numId="1" w16cid:durableId="280691300">
+    <w:abstractNumId w:val="2"/>
+  </w:num>
+  <w:num w:numId="2" w16cid:durableId="172646460">
+    <w:abstractNumId w:val="8"/>
+  </w:num>
+  <w:num w:numId="3" w16cid:durableId="33846187">
+    <w:abstractNumId w:val="6"/>
+  </w:num>
+  <w:num w:numId="4" w16cid:durableId="512036652">
     <w:abstractNumId w:val="0"/>
   </w:num>
-  <w:num w:numId="2" w16cid:durableId="172646460">
-    <w:abstractNumId w:val="2"/>
+  <w:num w:numId="5" w16cid:durableId="500659820">
+    <w:abstractNumId w:val="3"/>
   </w:num>
-  <w:num w:numId="3" w16cid:durableId="33846187">
+  <w:num w:numId="6" w16cid:durableId="21175598">
+    <w:abstractNumId w:val="5"/>
+  </w:num>
+  <w:num w:numId="7" w16cid:durableId="507451992">
     <w:abstractNumId w:val="1"/>
+  </w:num>
+  <w:num w:numId="8" w16cid:durableId="912929687">
+    <w:abstractNumId w:val="4"/>
+  </w:num>
+  <w:num w:numId="9" w16cid:durableId="2052532868">
+    <w:abstractNumId w:val="7"/>
   </w:num>
 </w:numbering>
 </file>

</xml_diff>

<commit_message>
Sprint 5 Maintenance: Improve results directory management
</commit_message>
<xml_diff>
--- a/docs/roadmap.docx
+++ b/docs/roadmap.docx
@@ -8620,6 +8620,156 @@
         </w:rPr>
         <w:t xml:space="preserve"> ExperimentRegistry</w:t>
       </w:r>
+    </w:p>
+    <w:p>
+      <w:pPr>
+        <w:spacing w:after="0" w:line="240" w:lineRule="auto"/>
+        <w:rPr>
+          <w:noProof/>
+          <w:sz w:val="28"/>
+          <w:szCs w:val="28"/>
+        </w:rPr>
+      </w:pPr>
+    </w:p>
+    <w:p>
+      <w:pPr>
+        <w:spacing w:after="0" w:line="240" w:lineRule="auto"/>
+        <w:rPr>
+          <w:b/>
+          <w:bCs/>
+          <w:noProof/>
+          <w:sz w:val="32"/>
+          <w:szCs w:val="32"/>
+          <w:u w:val="single"/>
+        </w:rPr>
+      </w:pPr>
+      <w:r>
+        <w:rPr>
+          <w:b/>
+          <w:bCs/>
+          <w:noProof/>
+          <w:sz w:val="32"/>
+          <w:szCs w:val="32"/>
+          <w:u w:val="single"/>
+        </w:rPr>
+        <w:t>Git Procedures:</w:t>
+      </w:r>
+    </w:p>
+    <w:p>
+      <w:pPr>
+        <w:spacing w:after="0" w:line="240" w:lineRule="auto"/>
+        <w:rPr>
+          <w:noProof/>
+          <w:sz w:val="28"/>
+          <w:szCs w:val="28"/>
+        </w:rPr>
+      </w:pPr>
+      <w:r>
+        <w:rPr>
+          <w:noProof/>
+          <w:sz w:val="28"/>
+          <w:szCs w:val="28"/>
+        </w:rPr>
+        <w:t>git add .</w:t>
+      </w:r>
+    </w:p>
+    <w:p>
+      <w:pPr>
+        <w:spacing w:after="0" w:line="240" w:lineRule="auto"/>
+        <w:rPr>
+          <w:noProof/>
+          <w:sz w:val="28"/>
+          <w:szCs w:val="28"/>
+        </w:rPr>
+      </w:pPr>
+      <w:r>
+        <w:rPr>
+          <w:noProof/>
+          <w:sz w:val="28"/>
+          <w:szCs w:val="28"/>
+        </w:rPr>
+        <w:t>git commit -m "</w:t>
+      </w:r>
+      <w:r>
+        <w:rPr>
+          <w:noProof/>
+          <w:sz w:val="28"/>
+          <w:szCs w:val="28"/>
+        </w:rPr>
+        <w:t>…</w:t>
+      </w:r>
+      <w:r>
+        <w:rPr>
+          <w:noProof/>
+          <w:sz w:val="28"/>
+          <w:szCs w:val="28"/>
+        </w:rPr>
+        <w:t>"</w:t>
+      </w:r>
+    </w:p>
+    <w:p>
+      <w:pPr>
+        <w:spacing w:after="0" w:line="240" w:lineRule="auto"/>
+        <w:rPr>
+          <w:noProof/>
+          <w:sz w:val="28"/>
+          <w:szCs w:val="28"/>
+        </w:rPr>
+      </w:pPr>
+      <w:r>
+        <w:rPr>
+          <w:noProof/>
+          <w:sz w:val="28"/>
+          <w:szCs w:val="28"/>
+        </w:rPr>
+        <w:t>git push</w:t>
+      </w:r>
+    </w:p>
+    <w:p>
+      <w:pPr>
+        <w:spacing w:after="0" w:line="240" w:lineRule="auto"/>
+        <w:rPr>
+          <w:noProof/>
+          <w:sz w:val="28"/>
+          <w:szCs w:val="28"/>
+        </w:rPr>
+      </w:pPr>
+      <w:r>
+        <w:rPr>
+          <w:noProof/>
+          <w:sz w:val="28"/>
+          <w:szCs w:val="28"/>
+        </w:rPr>
+        <w:t>git tag v0.5.0</w:t>
+      </w:r>
+    </w:p>
+    <w:p>
+      <w:pPr>
+        <w:spacing w:after="0" w:line="240" w:lineRule="auto"/>
+        <w:rPr>
+          <w:noProof/>
+          <w:sz w:val="28"/>
+          <w:szCs w:val="28"/>
+        </w:rPr>
+      </w:pPr>
+      <w:r>
+        <w:rPr>
+          <w:noProof/>
+          <w:sz w:val="28"/>
+          <w:szCs w:val="28"/>
+        </w:rPr>
+        <w:t>git push origin v0.5.0</w:t>
+      </w:r>
+    </w:p>
+    <w:p>
+      <w:pPr>
+        <w:spacing w:after="0" w:line="240" w:lineRule="auto"/>
+        <w:rPr>
+          <w:noProof/>
+          <w:sz w:val="28"/>
+          <w:szCs w:val="28"/>
+        </w:rPr>
+      </w:pPr>
     </w:p>
     <w:sectPr>
       <w:pgSz w:w="11906" w:h="16838"/>

</xml_diff>

<commit_message>
Sprint 7 - Commit 1 : Creation of Prognostics
</commit_message>
<xml_diff>
--- a/docs/roadmap.docx
+++ b/docs/roadmap.docx
@@ -496,6 +496,7 @@
           <w:szCs w:val="32"/>
         </w:rPr>
       </w:pPr>
+      <w:proofErr w:type="spellStart"/>
       <w:r>
         <w:rPr>
           <w:sz w:val="32"/>
@@ -504,6 +505,7 @@
         </w:rPr>
         <w:t>ForecastPipeline</w:t>
       </w:r>
+      <w:proofErr w:type="spellEnd"/>
     </w:p>
     <w:p>
       <w:pPr>
@@ -9965,6 +9967,1304 @@
           <w:szCs w:val="28"/>
         </w:rPr>
       </w:pPr>
+    </w:p>
+    <w:p>
+      <w:pPr>
+        <w:spacing w:after="0" w:line="240" w:lineRule="auto"/>
+        <w:rPr>
+          <w:noProof/>
+          <w:sz w:val="28"/>
+          <w:szCs w:val="28"/>
+        </w:rPr>
+      </w:pPr>
+    </w:p>
+    <w:p>
+      <w:pPr>
+        <w:spacing w:after="0" w:line="240" w:lineRule="auto"/>
+        <w:rPr>
+          <w:noProof/>
+          <w:sz w:val="28"/>
+          <w:szCs w:val="28"/>
+        </w:rPr>
+      </w:pPr>
+    </w:p>
+    <w:p>
+      <w:pPr>
+        <w:spacing w:after="0" w:line="240" w:lineRule="auto"/>
+        <w:rPr>
+          <w:noProof/>
+          <w:sz w:val="28"/>
+          <w:szCs w:val="28"/>
+        </w:rPr>
+      </w:pPr>
+    </w:p>
+    <w:p>
+      <w:pPr>
+        <w:spacing w:after="0" w:line="240" w:lineRule="auto"/>
+        <w:rPr>
+          <w:noProof/>
+          <w:sz w:val="28"/>
+          <w:szCs w:val="28"/>
+        </w:rPr>
+      </w:pPr>
+    </w:p>
+    <w:p>
+      <w:pPr>
+        <w:spacing w:after="0" w:line="240" w:lineRule="auto"/>
+        <w:rPr>
+          <w:noProof/>
+          <w:sz w:val="28"/>
+          <w:szCs w:val="28"/>
+        </w:rPr>
+      </w:pPr>
+    </w:p>
+    <w:p>
+      <w:pPr>
+        <w:spacing w:after="0" w:line="240" w:lineRule="auto"/>
+        <w:rPr>
+          <w:noProof/>
+          <w:sz w:val="28"/>
+          <w:szCs w:val="28"/>
+        </w:rPr>
+      </w:pPr>
+    </w:p>
+    <w:p>
+      <w:pPr>
+        <w:spacing w:after="0" w:line="240" w:lineRule="auto"/>
+        <w:rPr>
+          <w:noProof/>
+          <w:sz w:val="28"/>
+          <w:szCs w:val="28"/>
+        </w:rPr>
+      </w:pPr>
+    </w:p>
+    <w:p>
+      <w:pPr>
+        <w:spacing w:after="0" w:line="240" w:lineRule="auto"/>
+        <w:rPr>
+          <w:noProof/>
+          <w:sz w:val="28"/>
+          <w:szCs w:val="28"/>
+        </w:rPr>
+      </w:pPr>
+    </w:p>
+    <w:p>
+      <w:pPr>
+        <w:spacing w:after="0" w:line="240" w:lineRule="auto"/>
+        <w:rPr>
+          <w:noProof/>
+          <w:sz w:val="28"/>
+          <w:szCs w:val="28"/>
+        </w:rPr>
+      </w:pPr>
+    </w:p>
+    <w:p>
+      <w:pPr>
+        <w:spacing w:after="0" w:line="240" w:lineRule="auto"/>
+        <w:rPr>
+          <w:noProof/>
+          <w:sz w:val="28"/>
+          <w:szCs w:val="28"/>
+        </w:rPr>
+      </w:pPr>
+    </w:p>
+    <w:p>
+      <w:pPr>
+        <w:spacing w:after="0" w:line="240" w:lineRule="auto"/>
+        <w:rPr>
+          <w:noProof/>
+          <w:sz w:val="28"/>
+          <w:szCs w:val="28"/>
+        </w:rPr>
+      </w:pPr>
+    </w:p>
+    <w:p>
+      <w:pPr>
+        <w:spacing w:after="0" w:line="240" w:lineRule="auto"/>
+        <w:rPr>
+          <w:b/>
+          <w:bCs/>
+          <w:noProof/>
+          <w:sz w:val="28"/>
+          <w:szCs w:val="28"/>
+          <w:lang w:val="tr-TR"/>
+        </w:rPr>
+      </w:pPr>
+      <w:r>
+        <w:rPr>
+          <w:rFonts w:ascii="Segoe UI Symbol" w:hAnsi="Segoe UI Symbol" w:cs="Segoe UI Symbol"/>
+          <w:b/>
+          <w:bCs/>
+          <w:noProof/>
+          <w:sz w:val="28"/>
+          <w:szCs w:val="28"/>
+          <w:lang w:val="tr-TR"/>
+        </w:rPr>
+        <w:lastRenderedPageBreak/>
+        <w:t>✔</w:t>
+      </w:r>
+      <w:r>
+        <w:rPr>
+          <w:b/>
+          <w:bCs/>
+          <w:noProof/>
+          <w:sz w:val="28"/>
+          <w:szCs w:val="28"/>
+          <w:lang w:val="tr-TR"/>
+        </w:rPr>
+        <w:t xml:space="preserve"> Sprint 5</w:t>
+      </w:r>
+    </w:p>
+    <w:p>
+      <w:pPr>
+        <w:numPr>
+          <w:ilvl w:val="0"/>
+          <w:numId w:val="10"/>
+        </w:numPr>
+        <w:spacing w:after="0" w:line="240" w:lineRule="auto"/>
+        <w:rPr>
+          <w:noProof/>
+          <w:sz w:val="28"/>
+          <w:szCs w:val="28"/>
+          <w:lang w:val="tr-TR"/>
+        </w:rPr>
+      </w:pPr>
+      <w:r>
+        <w:rPr>
+          <w:noProof/>
+          <w:sz w:val="28"/>
+          <w:szCs w:val="28"/>
+          <w:lang w:val="tr-TR"/>
+        </w:rPr>
+        <w:t xml:space="preserve">ARIMA framework completed </w:t>
+      </w:r>
+    </w:p>
+    <w:p>
+      <w:pPr>
+        <w:numPr>
+          <w:ilvl w:val="0"/>
+          <w:numId w:val="10"/>
+        </w:numPr>
+        <w:spacing w:after="0" w:line="240" w:lineRule="auto"/>
+        <w:rPr>
+          <w:noProof/>
+          <w:sz w:val="28"/>
+          <w:szCs w:val="28"/>
+          <w:lang w:val="tr-TR"/>
+        </w:rPr>
+      </w:pPr>
+      <w:r>
+        <w:rPr>
+          <w:noProof/>
+          <w:sz w:val="28"/>
+          <w:szCs w:val="28"/>
+          <w:lang w:val="tr-TR"/>
+        </w:rPr>
+        <w:t xml:space="preserve">Experiment system </w:t>
+      </w:r>
+    </w:p>
+    <w:p>
+      <w:pPr>
+        <w:numPr>
+          <w:ilvl w:val="0"/>
+          <w:numId w:val="10"/>
+        </w:numPr>
+        <w:spacing w:after="0" w:line="240" w:lineRule="auto"/>
+        <w:rPr>
+          <w:noProof/>
+          <w:sz w:val="28"/>
+          <w:szCs w:val="28"/>
+          <w:lang w:val="tr-TR"/>
+        </w:rPr>
+      </w:pPr>
+      <w:r>
+        <w:rPr>
+          <w:noProof/>
+          <w:sz w:val="28"/>
+          <w:szCs w:val="28"/>
+          <w:lang w:val="tr-TR"/>
+        </w:rPr>
+        <w:t xml:space="preserve">Reports </w:t>
+      </w:r>
+    </w:p>
+    <w:p>
+      <w:pPr>
+        <w:numPr>
+          <w:ilvl w:val="0"/>
+          <w:numId w:val="10"/>
+        </w:numPr>
+        <w:spacing w:after="0" w:line="240" w:lineRule="auto"/>
+        <w:rPr>
+          <w:noProof/>
+          <w:sz w:val="28"/>
+          <w:szCs w:val="28"/>
+          <w:lang w:val="tr-TR"/>
+        </w:rPr>
+      </w:pPr>
+      <w:r>
+        <w:rPr>
+          <w:noProof/>
+          <w:sz w:val="28"/>
+          <w:szCs w:val="28"/>
+          <w:lang w:val="tr-TR"/>
+        </w:rPr>
+        <w:t xml:space="preserve">Metadata </w:t>
+      </w:r>
+    </w:p>
+    <w:p>
+      <w:pPr>
+        <w:numPr>
+          <w:ilvl w:val="0"/>
+          <w:numId w:val="10"/>
+        </w:numPr>
+        <w:spacing w:after="0" w:line="240" w:lineRule="auto"/>
+        <w:rPr>
+          <w:noProof/>
+          <w:sz w:val="28"/>
+          <w:szCs w:val="28"/>
+          <w:lang w:val="tr-TR"/>
+        </w:rPr>
+      </w:pPr>
+      <w:r>
+        <w:rPr>
+          <w:noProof/>
+          <w:sz w:val="28"/>
+          <w:szCs w:val="28"/>
+          <w:lang w:val="tr-TR"/>
+        </w:rPr>
+        <w:t xml:space="preserve">Plotting </w:t>
+      </w:r>
+    </w:p>
+    <w:p>
+      <w:pPr>
+        <w:numPr>
+          <w:ilvl w:val="0"/>
+          <w:numId w:val="10"/>
+        </w:numPr>
+        <w:spacing w:after="0" w:line="240" w:lineRule="auto"/>
+        <w:rPr>
+          <w:noProof/>
+          <w:sz w:val="28"/>
+          <w:szCs w:val="28"/>
+          <w:lang w:val="tr-TR"/>
+        </w:rPr>
+      </w:pPr>
+      <w:r>
+        <w:rPr>
+          <w:noProof/>
+          <w:sz w:val="28"/>
+          <w:szCs w:val="28"/>
+          <w:lang w:val="tr-TR"/>
+        </w:rPr>
+        <w:t xml:space="preserve">Registry </w:t>
+      </w:r>
+    </w:p>
+    <w:p>
+      <w:pPr>
+        <w:numPr>
+          <w:ilvl w:val="0"/>
+          <w:numId w:val="10"/>
+        </w:numPr>
+        <w:spacing w:after="0" w:line="240" w:lineRule="auto"/>
+        <w:rPr>
+          <w:noProof/>
+          <w:sz w:val="28"/>
+          <w:szCs w:val="28"/>
+          <w:lang w:val="tr-TR"/>
+        </w:rPr>
+      </w:pPr>
+      <w:r>
+        <w:rPr>
+          <w:noProof/>
+          <w:sz w:val="28"/>
+          <w:szCs w:val="28"/>
+          <w:lang w:val="tr-TR"/>
+        </w:rPr>
+        <w:t xml:space="preserve">Result files </w:t>
+      </w:r>
+    </w:p>
+    <w:p>
+      <w:pPr>
+        <w:spacing w:after="0" w:line="240" w:lineRule="auto"/>
+        <w:rPr>
+          <w:rFonts w:ascii="Segoe UI Symbol" w:hAnsi="Segoe UI Symbol" w:cs="Segoe UI Symbol"/>
+          <w:b/>
+          <w:bCs/>
+          <w:noProof/>
+          <w:sz w:val="28"/>
+          <w:szCs w:val="28"/>
+          <w:lang w:val="tr-TR"/>
+        </w:rPr>
+      </w:pPr>
+    </w:p>
+    <w:p>
+      <w:pPr>
+        <w:spacing w:after="0" w:line="240" w:lineRule="auto"/>
+        <w:rPr>
+          <w:rFonts w:ascii="Segoe UI Symbol" w:hAnsi="Segoe UI Symbol" w:cs="Segoe UI Symbol"/>
+          <w:b/>
+          <w:bCs/>
+          <w:noProof/>
+          <w:sz w:val="28"/>
+          <w:szCs w:val="28"/>
+          <w:lang w:val="tr-TR"/>
+        </w:rPr>
+      </w:pPr>
+    </w:p>
+    <w:p>
+      <w:pPr>
+        <w:spacing w:after="0" w:line="240" w:lineRule="auto"/>
+        <w:rPr>
+          <w:b/>
+          <w:bCs/>
+          <w:noProof/>
+          <w:sz w:val="28"/>
+          <w:szCs w:val="28"/>
+          <w:lang w:val="tr-TR"/>
+        </w:rPr>
+      </w:pPr>
+      <w:r>
+        <w:rPr>
+          <w:rFonts w:ascii="Segoe UI Symbol" w:hAnsi="Segoe UI Symbol" w:cs="Segoe UI Symbol"/>
+          <w:b/>
+          <w:bCs/>
+          <w:noProof/>
+          <w:sz w:val="28"/>
+          <w:szCs w:val="28"/>
+          <w:lang w:val="tr-TR"/>
+        </w:rPr>
+        <w:t>✔</w:t>
+      </w:r>
+      <w:r>
+        <w:rPr>
+          <w:b/>
+          <w:bCs/>
+          <w:noProof/>
+          <w:sz w:val="28"/>
+          <w:szCs w:val="28"/>
+          <w:lang w:val="tr-TR"/>
+        </w:rPr>
+        <w:t xml:space="preserve"> Sprint 6 (so far)</w:t>
+      </w:r>
+    </w:p>
+    <w:p>
+      <w:pPr>
+        <w:numPr>
+          <w:ilvl w:val="0"/>
+          <w:numId w:val="11"/>
+        </w:numPr>
+        <w:spacing w:after="0" w:line="240" w:lineRule="auto"/>
+        <w:rPr>
+          <w:noProof/>
+          <w:sz w:val="28"/>
+          <w:szCs w:val="28"/>
+          <w:lang w:val="tr-TR"/>
+        </w:rPr>
+      </w:pPr>
+      <w:r>
+        <w:rPr>
+          <w:noProof/>
+          <w:sz w:val="28"/>
+          <w:szCs w:val="28"/>
+          <w:lang w:val="tr-TR"/>
+        </w:rPr>
+        <w:t xml:space="preserve">KalmanForecaster </w:t>
+      </w:r>
+    </w:p>
+    <w:p>
+      <w:pPr>
+        <w:numPr>
+          <w:ilvl w:val="0"/>
+          <w:numId w:val="11"/>
+        </w:numPr>
+        <w:spacing w:after="0" w:line="240" w:lineRule="auto"/>
+        <w:rPr>
+          <w:noProof/>
+          <w:sz w:val="28"/>
+          <w:szCs w:val="28"/>
+          <w:lang w:val="tr-TR"/>
+        </w:rPr>
+      </w:pPr>
+      <w:r>
+        <w:rPr>
+          <w:noProof/>
+          <w:sz w:val="28"/>
+          <w:szCs w:val="28"/>
+          <w:lang w:val="tr-TR"/>
+        </w:rPr>
+        <w:t xml:space="preserve">demo_kalman.py </w:t>
+      </w:r>
+    </w:p>
+    <w:p>
+      <w:pPr>
+        <w:numPr>
+          <w:ilvl w:val="0"/>
+          <w:numId w:val="11"/>
+        </w:numPr>
+        <w:spacing w:after="0" w:line="240" w:lineRule="auto"/>
+        <w:rPr>
+          <w:noProof/>
+          <w:sz w:val="28"/>
+          <w:szCs w:val="28"/>
+          <w:lang w:val="tr-TR"/>
+        </w:rPr>
+      </w:pPr>
+      <w:r>
+        <w:rPr>
+          <w:noProof/>
+          <w:sz w:val="28"/>
+          <w:szCs w:val="28"/>
+          <w:lang w:val="tr-TR"/>
+        </w:rPr>
+        <w:t xml:space="preserve">Kalman metadata </w:t>
+      </w:r>
+    </w:p>
+    <w:p>
+      <w:pPr>
+        <w:numPr>
+          <w:ilvl w:val="0"/>
+          <w:numId w:val="11"/>
+        </w:numPr>
+        <w:spacing w:after="0" w:line="240" w:lineRule="auto"/>
+        <w:rPr>
+          <w:noProof/>
+          <w:sz w:val="28"/>
+          <w:szCs w:val="28"/>
+          <w:lang w:val="tr-TR"/>
+        </w:rPr>
+      </w:pPr>
+      <w:r>
+        <w:rPr>
+          <w:noProof/>
+          <w:sz w:val="28"/>
+          <w:szCs w:val="28"/>
+          <w:lang w:val="tr-TR"/>
+        </w:rPr>
+        <w:t xml:space="preserve">Bias correction </w:t>
+      </w:r>
+    </w:p>
+    <w:p>
+      <w:pPr>
+        <w:numPr>
+          <w:ilvl w:val="0"/>
+          <w:numId w:val="11"/>
+        </w:numPr>
+        <w:spacing w:after="0" w:line="240" w:lineRule="auto"/>
+        <w:rPr>
+          <w:noProof/>
+          <w:sz w:val="28"/>
+          <w:szCs w:val="28"/>
+          <w:lang w:val="tr-TR"/>
+        </w:rPr>
+      </w:pPr>
+      <w:r>
+        <w:rPr>
+          <w:noProof/>
+          <w:sz w:val="28"/>
+          <w:szCs w:val="28"/>
+          <w:lang w:val="tr-TR"/>
+        </w:rPr>
+        <w:t xml:space="preserve">Adaptive regimes </w:t>
+      </w:r>
+    </w:p>
+    <w:p>
+      <w:pPr>
+        <w:numPr>
+          <w:ilvl w:val="0"/>
+          <w:numId w:val="11"/>
+        </w:numPr>
+        <w:spacing w:after="0" w:line="240" w:lineRule="auto"/>
+        <w:rPr>
+          <w:noProof/>
+          <w:sz w:val="28"/>
+          <w:szCs w:val="28"/>
+          <w:lang w:val="tr-TR"/>
+        </w:rPr>
+      </w:pPr>
+      <w:r>
+        <w:rPr>
+          <w:noProof/>
+          <w:sz w:val="28"/>
+          <w:szCs w:val="28"/>
+          <w:lang w:val="tr-TR"/>
+        </w:rPr>
+        <w:t xml:space="preserve">Report integration </w:t>
+      </w:r>
+    </w:p>
+    <w:p>
+      <w:pPr>
+        <w:numPr>
+          <w:ilvl w:val="0"/>
+          <w:numId w:val="11"/>
+        </w:numPr>
+        <w:spacing w:after="0" w:line="240" w:lineRule="auto"/>
+        <w:rPr>
+          <w:noProof/>
+          <w:sz w:val="28"/>
+          <w:szCs w:val="28"/>
+          <w:lang w:val="tr-TR"/>
+        </w:rPr>
+      </w:pPr>
+      <w:r>
+        <w:rPr>
+          <w:noProof/>
+          <w:sz w:val="28"/>
+          <w:szCs w:val="28"/>
+          <w:lang w:val="tr-TR"/>
+        </w:rPr>
+        <w:t xml:space="preserve">JSON integration </w:t>
+      </w:r>
+    </w:p>
+    <w:p>
+      <w:pPr>
+        <w:numPr>
+          <w:ilvl w:val="0"/>
+          <w:numId w:val="11"/>
+        </w:numPr>
+        <w:spacing w:after="0" w:line="240" w:lineRule="auto"/>
+        <w:rPr>
+          <w:noProof/>
+          <w:sz w:val="28"/>
+          <w:szCs w:val="28"/>
+          <w:lang w:val="tr-TR"/>
+        </w:rPr>
+      </w:pPr>
+      <w:r>
+        <w:rPr>
+          <w:noProof/>
+          <w:sz w:val="28"/>
+          <w:szCs w:val="28"/>
+          <w:lang w:val="tr-TR"/>
+        </w:rPr>
+        <w:t xml:space="preserve">Experiment registration fixed </w:t>
+      </w:r>
+    </w:p>
+    <w:p>
+      <w:pPr>
+        <w:numPr>
+          <w:ilvl w:val="0"/>
+          <w:numId w:val="11"/>
+        </w:numPr>
+        <w:spacing w:after="0" w:line="240" w:lineRule="auto"/>
+        <w:rPr>
+          <w:noProof/>
+          <w:sz w:val="28"/>
+          <w:szCs w:val="28"/>
+          <w:lang w:val="tr-TR"/>
+        </w:rPr>
+      </w:pPr>
+      <w:r>
+        <w:rPr>
+          <w:noProof/>
+          <w:sz w:val="28"/>
+          <w:szCs w:val="28"/>
+          <w:lang w:val="tr-TR"/>
+        </w:rPr>
+        <w:t>Report formatting improved</w:t>
+      </w:r>
+    </w:p>
+    <w:p>
+      <w:pPr>
+        <w:spacing w:after="0" w:line="240" w:lineRule="auto"/>
+        <w:rPr>
+          <w:noProof/>
+          <w:sz w:val="28"/>
+          <w:szCs w:val="28"/>
+        </w:rPr>
+      </w:pPr>
+    </w:p>
+    <w:p>
+      <w:pPr>
+        <w:spacing w:after="0" w:line="240" w:lineRule="auto"/>
+        <w:rPr>
+          <w:noProof/>
+          <w:sz w:val="28"/>
+          <w:szCs w:val="28"/>
+        </w:rPr>
+      </w:pPr>
+    </w:p>
+    <w:p>
+      <w:pPr>
+        <w:spacing w:after="0" w:line="240" w:lineRule="auto"/>
+        <w:rPr>
+          <w:noProof/>
+          <w:sz w:val="28"/>
+          <w:szCs w:val="28"/>
+        </w:rPr>
+      </w:pPr>
+    </w:p>
+    <w:p>
+      <w:pPr>
+        <w:spacing w:after="0" w:line="240" w:lineRule="auto"/>
+        <w:rPr>
+          <w:noProof/>
+          <w:sz w:val="28"/>
+          <w:szCs w:val="28"/>
+        </w:rPr>
+      </w:pPr>
+    </w:p>
+    <w:p>
+      <w:pPr>
+        <w:spacing w:after="0" w:line="240" w:lineRule="auto"/>
+        <w:rPr>
+          <w:noProof/>
+          <w:sz w:val="28"/>
+          <w:szCs w:val="28"/>
+        </w:rPr>
+      </w:pPr>
+    </w:p>
+    <w:p>
+      <w:pPr>
+        <w:spacing w:after="0" w:line="240" w:lineRule="auto"/>
+        <w:rPr>
+          <w:noProof/>
+          <w:sz w:val="28"/>
+          <w:szCs w:val="28"/>
+        </w:rPr>
+      </w:pPr>
+    </w:p>
+    <w:p>
+      <w:pPr>
+        <w:spacing w:after="0" w:line="240" w:lineRule="auto"/>
+        <w:rPr>
+          <w:noProof/>
+          <w:sz w:val="28"/>
+          <w:szCs w:val="28"/>
+        </w:rPr>
+      </w:pPr>
+    </w:p>
+    <w:p>
+      <w:pPr>
+        <w:spacing w:after="0" w:line="240" w:lineRule="auto"/>
+        <w:rPr>
+          <w:noProof/>
+          <w:sz w:val="28"/>
+          <w:szCs w:val="28"/>
+        </w:rPr>
+      </w:pPr>
+    </w:p>
+    <w:p>
+      <w:pPr>
+        <w:spacing w:after="0" w:line="240" w:lineRule="auto"/>
+        <w:rPr>
+          <w:noProof/>
+          <w:sz w:val="28"/>
+          <w:szCs w:val="28"/>
+        </w:rPr>
+      </w:pPr>
+    </w:p>
+    <w:p>
+      <w:pPr>
+        <w:spacing w:after="0" w:line="240" w:lineRule="auto"/>
+        <w:rPr>
+          <w:noProof/>
+          <w:sz w:val="28"/>
+          <w:szCs w:val="28"/>
+        </w:rPr>
+      </w:pPr>
+    </w:p>
+    <w:p>
+      <w:pPr>
+        <w:spacing w:after="0" w:line="240" w:lineRule="auto"/>
+        <w:rPr>
+          <w:noProof/>
+          <w:sz w:val="28"/>
+          <w:szCs w:val="28"/>
+        </w:rPr>
+      </w:pPr>
+    </w:p>
+    <w:p>
+      <w:pPr>
+        <w:spacing w:after="0" w:line="240" w:lineRule="auto"/>
+        <w:rPr>
+          <w:noProof/>
+          <w:sz w:val="28"/>
+          <w:szCs w:val="28"/>
+        </w:rPr>
+      </w:pPr>
+    </w:p>
+    <w:p>
+      <w:pPr>
+        <w:spacing w:after="0" w:line="240" w:lineRule="auto"/>
+        <w:rPr>
+          <w:noProof/>
+          <w:sz w:val="28"/>
+          <w:szCs w:val="28"/>
+        </w:rPr>
+      </w:pPr>
+    </w:p>
+    <w:p>
+      <w:pPr>
+        <w:spacing w:after="0" w:line="240" w:lineRule="auto"/>
+        <w:rPr>
+          <w:noProof/>
+          <w:sz w:val="28"/>
+          <w:szCs w:val="28"/>
+        </w:rPr>
+      </w:pPr>
+    </w:p>
+    <w:p>
+      <w:pPr>
+        <w:spacing w:after="0" w:line="240" w:lineRule="auto"/>
+        <w:rPr>
+          <w:noProof/>
+          <w:sz w:val="28"/>
+          <w:szCs w:val="28"/>
+        </w:rPr>
+      </w:pPr>
+    </w:p>
+    <w:p>
+      <w:pPr>
+        <w:spacing w:after="0" w:line="240" w:lineRule="auto"/>
+        <w:rPr>
+          <w:noProof/>
+          <w:sz w:val="28"/>
+          <w:szCs w:val="28"/>
+        </w:rPr>
+      </w:pPr>
+    </w:p>
+    <w:p>
+      <w:pPr>
+        <w:spacing w:after="0" w:line="240" w:lineRule="auto"/>
+        <w:rPr>
+          <w:noProof/>
+          <w:sz w:val="28"/>
+          <w:szCs w:val="28"/>
+        </w:rPr>
+      </w:pPr>
+    </w:p>
+    <w:p>
+      <w:pPr>
+        <w:spacing w:after="0" w:line="240" w:lineRule="auto"/>
+        <w:rPr>
+          <w:noProof/>
+          <w:sz w:val="28"/>
+          <w:szCs w:val="28"/>
+        </w:rPr>
+      </w:pPr>
+    </w:p>
+    <w:p>
+      <w:pPr>
+        <w:spacing w:after="0" w:line="240" w:lineRule="auto"/>
+        <w:rPr>
+          <w:noProof/>
+          <w:sz w:val="28"/>
+          <w:szCs w:val="28"/>
+        </w:rPr>
+      </w:pPr>
+    </w:p>
+    <w:p>
+      <w:pPr>
+        <w:spacing w:after="0" w:line="240" w:lineRule="auto"/>
+        <w:rPr>
+          <w:noProof/>
+          <w:sz w:val="28"/>
+          <w:szCs w:val="28"/>
+        </w:rPr>
+      </w:pPr>
+    </w:p>
+    <w:p>
+      <w:pPr>
+        <w:spacing w:after="0" w:line="240" w:lineRule="auto"/>
+        <w:rPr>
+          <w:b/>
+          <w:bCs/>
+          <w:noProof/>
+          <w:sz w:val="28"/>
+          <w:szCs w:val="28"/>
+          <w:u w:val="single"/>
+          <w:lang w:val="tr-TR"/>
+        </w:rPr>
+      </w:pPr>
+      <w:r>
+        <w:rPr>
+          <w:b/>
+          <w:bCs/>
+          <w:noProof/>
+          <w:sz w:val="28"/>
+          <w:szCs w:val="28"/>
+          <w:u w:val="single"/>
+          <w:lang w:val="tr-TR"/>
+        </w:rPr>
+        <w:t>Sprint 7</w:t>
+      </w:r>
+      <w:r>
+        <w:rPr>
+          <w:b/>
+          <w:bCs/>
+          <w:noProof/>
+          <w:sz w:val="28"/>
+          <w:szCs w:val="28"/>
+          <w:u w:val="single"/>
+          <w:lang w:val="tr-TR"/>
+        </w:rPr>
+        <w:t xml:space="preserve"> :</w:t>
+      </w:r>
+    </w:p>
+    <w:p>
+      <w:pPr>
+        <w:spacing w:after="0" w:line="240" w:lineRule="auto"/>
+        <w:rPr>
+          <w:noProof/>
+          <w:sz w:val="28"/>
+          <w:szCs w:val="28"/>
+          <w:lang w:val="tr-TR"/>
+        </w:rPr>
+      </w:pPr>
+    </w:p>
+    <w:p>
+      <w:pPr>
+        <w:spacing w:after="0" w:line="240" w:lineRule="auto"/>
+        <w:rPr>
+          <w:noProof/>
+          <w:sz w:val="28"/>
+          <w:szCs w:val="28"/>
+          <w:lang w:val="tr-TR"/>
+        </w:rPr>
+      </w:pPr>
+      <w:r>
+        <w:rPr>
+          <w:b/>
+          <w:bCs/>
+          <w:noProof/>
+          <w:sz w:val="28"/>
+          <w:szCs w:val="28"/>
+          <w:lang w:val="tr-TR"/>
+        </w:rPr>
+        <w:t>Commit 1</w:t>
+      </w:r>
+    </w:p>
+    <w:p>
+      <w:pPr>
+        <w:numPr>
+          <w:ilvl w:val="0"/>
+          <w:numId w:val="12"/>
+        </w:numPr>
+        <w:spacing w:after="0" w:line="240" w:lineRule="auto"/>
+        <w:rPr>
+          <w:noProof/>
+          <w:sz w:val="28"/>
+          <w:szCs w:val="28"/>
+          <w:lang w:val="tr-TR"/>
+        </w:rPr>
+      </w:pPr>
+      <w:r>
+        <w:rPr>
+          <w:noProof/>
+          <w:sz w:val="28"/>
+          <w:szCs w:val="28"/>
+          <w:lang w:val="tr-TR"/>
+        </w:rPr>
+        <w:t xml:space="preserve">prognostics/ package </w:t>
+      </w:r>
+    </w:p>
+    <w:p>
+      <w:pPr>
+        <w:numPr>
+          <w:ilvl w:val="0"/>
+          <w:numId w:val="12"/>
+        </w:numPr>
+        <w:spacing w:after="0" w:line="240" w:lineRule="auto"/>
+        <w:rPr>
+          <w:noProof/>
+          <w:sz w:val="28"/>
+          <w:szCs w:val="28"/>
+          <w:lang w:val="tr-TR"/>
+        </w:rPr>
+      </w:pPr>
+      <w:r>
+        <w:rPr>
+          <w:noProof/>
+          <w:sz w:val="28"/>
+          <w:szCs w:val="28"/>
+          <w:lang w:val="tr-TR"/>
+        </w:rPr>
+        <w:t xml:space="preserve">ThresholdEstimator </w:t>
+      </w:r>
+    </w:p>
+    <w:p>
+      <w:pPr>
+        <w:spacing w:after="0" w:line="240" w:lineRule="auto"/>
+        <w:rPr>
+          <w:noProof/>
+          <w:sz w:val="28"/>
+          <w:szCs w:val="28"/>
+          <w:lang w:val="tr-TR"/>
+        </w:rPr>
+      </w:pPr>
+      <w:r>
+        <w:rPr>
+          <w:b/>
+          <w:bCs/>
+          <w:noProof/>
+          <w:sz w:val="28"/>
+          <w:szCs w:val="28"/>
+          <w:lang w:val="tr-TR"/>
+        </w:rPr>
+        <w:t>Commit 2</w:t>
+      </w:r>
+    </w:p>
+    <w:p>
+      <w:pPr>
+        <w:numPr>
+          <w:ilvl w:val="0"/>
+          <w:numId w:val="13"/>
+        </w:numPr>
+        <w:spacing w:after="0" w:line="240" w:lineRule="auto"/>
+        <w:rPr>
+          <w:noProof/>
+          <w:sz w:val="28"/>
+          <w:szCs w:val="28"/>
+          <w:lang w:val="tr-TR"/>
+        </w:rPr>
+      </w:pPr>
+      <w:r>
+        <w:rPr>
+          <w:noProof/>
+          <w:sz w:val="28"/>
+          <w:szCs w:val="28"/>
+          <w:lang w:val="tr-TR"/>
+        </w:rPr>
+        <w:t xml:space="preserve">Generic MonteCarloRUL </w:t>
+      </w:r>
+    </w:p>
+    <w:p>
+      <w:pPr>
+        <w:spacing w:after="0" w:line="240" w:lineRule="auto"/>
+        <w:rPr>
+          <w:noProof/>
+          <w:sz w:val="28"/>
+          <w:szCs w:val="28"/>
+          <w:lang w:val="tr-TR"/>
+        </w:rPr>
+      </w:pPr>
+      <w:r>
+        <w:rPr>
+          <w:b/>
+          <w:bCs/>
+          <w:noProof/>
+          <w:sz w:val="28"/>
+          <w:szCs w:val="28"/>
+          <w:lang w:val="tr-TR"/>
+        </w:rPr>
+        <w:t>Commit 3</w:t>
+      </w:r>
+    </w:p>
+    <w:p>
+      <w:pPr>
+        <w:numPr>
+          <w:ilvl w:val="0"/>
+          <w:numId w:val="14"/>
+        </w:numPr>
+        <w:spacing w:after="0" w:line="240" w:lineRule="auto"/>
+        <w:rPr>
+          <w:noProof/>
+          <w:sz w:val="28"/>
+          <w:szCs w:val="28"/>
+          <w:lang w:val="tr-TR"/>
+        </w:rPr>
+      </w:pPr>
+      <w:r>
+        <w:rPr>
+          <w:noProof/>
+          <w:sz w:val="28"/>
+          <w:szCs w:val="28"/>
+          <w:lang w:val="tr-TR"/>
+        </w:rPr>
+        <w:t xml:space="preserve">PrognosticResult </w:t>
+      </w:r>
+    </w:p>
+    <w:p>
+      <w:pPr>
+        <w:numPr>
+          <w:ilvl w:val="0"/>
+          <w:numId w:val="14"/>
+        </w:numPr>
+        <w:spacing w:after="0" w:line="240" w:lineRule="auto"/>
+        <w:rPr>
+          <w:noProof/>
+          <w:sz w:val="28"/>
+          <w:szCs w:val="28"/>
+          <w:lang w:val="tr-TR"/>
+        </w:rPr>
+      </w:pPr>
+      <w:r>
+        <w:rPr>
+          <w:noProof/>
+          <w:sz w:val="28"/>
+          <w:szCs w:val="28"/>
+          <w:lang w:val="tr-TR"/>
+        </w:rPr>
+        <w:t xml:space="preserve">RUL reports </w:t>
+      </w:r>
+    </w:p>
+    <w:p>
+      <w:pPr>
+        <w:numPr>
+          <w:ilvl w:val="0"/>
+          <w:numId w:val="14"/>
+        </w:numPr>
+        <w:spacing w:after="0" w:line="240" w:lineRule="auto"/>
+        <w:rPr>
+          <w:noProof/>
+          <w:sz w:val="28"/>
+          <w:szCs w:val="28"/>
+          <w:lang w:val="tr-TR"/>
+        </w:rPr>
+      </w:pPr>
+      <w:r>
+        <w:rPr>
+          <w:noProof/>
+          <w:sz w:val="28"/>
+          <w:szCs w:val="28"/>
+          <w:lang w:val="tr-TR"/>
+        </w:rPr>
+        <w:t xml:space="preserve">RUL plots </w:t>
+      </w:r>
+    </w:p>
+    <w:p>
+      <w:pPr>
+        <w:numPr>
+          <w:ilvl w:val="0"/>
+          <w:numId w:val="14"/>
+        </w:numPr>
+        <w:spacing w:after="0" w:line="240" w:lineRule="auto"/>
+        <w:rPr>
+          <w:noProof/>
+          <w:sz w:val="28"/>
+          <w:szCs w:val="28"/>
+          <w:lang w:val="tr-TR"/>
+        </w:rPr>
+      </w:pPr>
+      <w:r>
+        <w:rPr>
+          <w:noProof/>
+          <w:sz w:val="28"/>
+          <w:szCs w:val="28"/>
+          <w:lang w:val="tr-TR"/>
+        </w:rPr>
+        <w:t>Confidence intervals</w:t>
+      </w:r>
+    </w:p>
+    <w:p>
+      <w:pPr>
+        <w:spacing w:after="0" w:line="240" w:lineRule="auto"/>
+        <w:rPr>
+          <w:noProof/>
+          <w:sz w:val="28"/>
+          <w:szCs w:val="28"/>
+          <w:lang w:val="tr-TR"/>
+        </w:rPr>
+      </w:pPr>
+    </w:p>
+    <w:p>
+      <w:pPr>
+        <w:spacing w:after="0" w:line="240" w:lineRule="auto"/>
+        <w:rPr>
+          <w:noProof/>
+          <w:sz w:val="28"/>
+          <w:szCs w:val="28"/>
+          <w:lang w:val="tr-TR"/>
+        </w:rPr>
+      </w:pPr>
+    </w:p>
+    <w:p>
+      <w:pPr>
+        <w:spacing w:after="0" w:line="240" w:lineRule="auto"/>
+        <w:rPr>
+          <w:b/>
+          <w:bCs/>
+          <w:noProof/>
+          <w:sz w:val="28"/>
+          <w:szCs w:val="28"/>
+        </w:rPr>
+      </w:pPr>
+      <w:r>
+        <w:rPr>
+          <w:b/>
+          <w:bCs/>
+          <w:noProof/>
+          <w:sz w:val="28"/>
+          <w:szCs w:val="28"/>
+        </w:rPr>
+        <w:t>Forecasting</w:t>
+      </w:r>
+    </w:p>
+    <w:p>
+      <w:pPr>
+        <w:spacing w:after="0" w:line="240" w:lineRule="auto"/>
+        <w:rPr>
+          <w:b/>
+          <w:bCs/>
+          <w:noProof/>
+          <w:sz w:val="28"/>
+          <w:szCs w:val="28"/>
+        </w:rPr>
+      </w:pPr>
+      <w:r>
+        <w:rPr>
+          <w:b/>
+          <w:bCs/>
+          <w:noProof/>
+          <w:sz w:val="28"/>
+          <w:szCs w:val="28"/>
+        </w:rPr>
+        <w:t>------------</w:t>
+      </w:r>
+    </w:p>
+    <w:p>
+      <w:pPr>
+        <w:spacing w:after="0" w:line="240" w:lineRule="auto"/>
+        <w:rPr>
+          <w:noProof/>
+          <w:sz w:val="28"/>
+          <w:szCs w:val="28"/>
+        </w:rPr>
+      </w:pPr>
+      <w:r>
+        <w:rPr>
+          <w:noProof/>
+          <w:sz w:val="28"/>
+          <w:szCs w:val="28"/>
+        </w:rPr>
+        <w:t>ForecastResult</w:t>
+      </w:r>
+    </w:p>
+    <w:p>
+      <w:pPr>
+        <w:spacing w:after="0" w:line="240" w:lineRule="auto"/>
+        <w:rPr>
+          <w:noProof/>
+          <w:sz w:val="28"/>
+          <w:szCs w:val="28"/>
+        </w:rPr>
+      </w:pPr>
+      <w:r>
+        <w:rPr>
+          <w:noProof/>
+          <w:sz w:val="28"/>
+          <w:szCs w:val="28"/>
+        </w:rPr>
+        <w:t>ARIMAForecaster</w:t>
+      </w:r>
+    </w:p>
+    <w:p>
+      <w:pPr>
+        <w:spacing w:after="0" w:line="240" w:lineRule="auto"/>
+        <w:rPr>
+          <w:noProof/>
+          <w:sz w:val="28"/>
+          <w:szCs w:val="28"/>
+        </w:rPr>
+      </w:pPr>
+      <w:r>
+        <w:rPr>
+          <w:noProof/>
+          <w:sz w:val="28"/>
+          <w:szCs w:val="28"/>
+        </w:rPr>
+        <w:t>KalmanForecaster</w:t>
+      </w:r>
+    </w:p>
+    <w:p>
+      <w:pPr>
+        <w:spacing w:after="0" w:line="240" w:lineRule="auto"/>
+        <w:rPr>
+          <w:noProof/>
+          <w:sz w:val="28"/>
+          <w:szCs w:val="28"/>
+        </w:rPr>
+      </w:pPr>
+    </w:p>
+    <w:p>
+      <w:pPr>
+        <w:spacing w:after="0" w:line="240" w:lineRule="auto"/>
+        <w:rPr>
+          <w:noProof/>
+          <w:sz w:val="28"/>
+          <w:szCs w:val="28"/>
+        </w:rPr>
+      </w:pPr>
+    </w:p>
+    <w:p>
+      <w:pPr>
+        <w:spacing w:after="0" w:line="240" w:lineRule="auto"/>
+        <w:rPr>
+          <w:b/>
+          <w:bCs/>
+          <w:noProof/>
+          <w:sz w:val="28"/>
+          <w:szCs w:val="28"/>
+        </w:rPr>
+      </w:pPr>
+      <w:r>
+        <w:rPr>
+          <w:b/>
+          <w:bCs/>
+          <w:noProof/>
+          <w:sz w:val="28"/>
+          <w:szCs w:val="28"/>
+        </w:rPr>
+        <w:t>Prognostics</w:t>
+      </w:r>
+    </w:p>
+    <w:p>
+      <w:pPr>
+        <w:spacing w:after="0" w:line="240" w:lineRule="auto"/>
+        <w:rPr>
+          <w:b/>
+          <w:bCs/>
+          <w:noProof/>
+          <w:sz w:val="28"/>
+          <w:szCs w:val="28"/>
+        </w:rPr>
+      </w:pPr>
+      <w:r>
+        <w:rPr>
+          <w:b/>
+          <w:bCs/>
+          <w:noProof/>
+          <w:sz w:val="28"/>
+          <w:szCs w:val="28"/>
+        </w:rPr>
+        <w:t>------------</w:t>
+      </w:r>
+    </w:p>
+    <w:p>
+      <w:pPr>
+        <w:spacing w:after="0" w:line="240" w:lineRule="auto"/>
+        <w:rPr>
+          <w:noProof/>
+          <w:sz w:val="28"/>
+          <w:szCs w:val="28"/>
+        </w:rPr>
+      </w:pPr>
+      <w:r>
+        <w:rPr>
+          <w:noProof/>
+          <w:sz w:val="28"/>
+          <w:szCs w:val="28"/>
+        </w:rPr>
+        <w:t>PrognosticResult</w:t>
+      </w:r>
+    </w:p>
+    <w:p>
+      <w:pPr>
+        <w:spacing w:after="0" w:line="240" w:lineRule="auto"/>
+        <w:rPr>
+          <w:noProof/>
+          <w:sz w:val="28"/>
+          <w:szCs w:val="28"/>
+        </w:rPr>
+      </w:pPr>
+      <w:r>
+        <w:rPr>
+          <w:noProof/>
+          <w:sz w:val="28"/>
+          <w:szCs w:val="28"/>
+        </w:rPr>
+        <w:t>ThresholdEstimator</w:t>
+      </w:r>
     </w:p>
     <w:p>
       <w:pPr>
@@ -10158,9 +11458,9 @@
     </w:lvl>
   </w:abstractNum>
   <w:abstractNum w:abstractNumId="1" w15:restartNumberingAfterBreak="0">
-    <w:nsid w:val="26B647B2"/>
+    <w:nsid w:val="0C944488"/>
     <w:multiLevelType w:val="multilevel"/>
-    <w:tmpl w:val="8342140A"/>
+    <w:tmpl w:val="A266BBA2"/>
     <w:lvl w:ilvl="0">
       <w:start w:val="1"/>
       <w:numFmt w:val="bullet"/>
@@ -10307,9 +11607,9 @@
     </w:lvl>
   </w:abstractNum>
   <w:abstractNum w:abstractNumId="2" w15:restartNumberingAfterBreak="0">
-    <w:nsid w:val="320E0B82"/>
+    <w:nsid w:val="16487725"/>
     <w:multiLevelType w:val="multilevel"/>
-    <w:tmpl w:val="67A0C5AE"/>
+    <w:tmpl w:val="25382BE4"/>
     <w:lvl w:ilvl="0">
       <w:start w:val="1"/>
       <w:numFmt w:val="bullet"/>
@@ -10456,9 +11756,9 @@
     </w:lvl>
   </w:abstractNum>
   <w:abstractNum w:abstractNumId="3" w15:restartNumberingAfterBreak="0">
-    <w:nsid w:val="3DB2253E"/>
+    <w:nsid w:val="24EF2950"/>
     <w:multiLevelType w:val="multilevel"/>
-    <w:tmpl w:val="F1E0B30A"/>
+    <w:tmpl w:val="411AD802"/>
     <w:lvl w:ilvl="0">
       <w:start w:val="1"/>
       <w:numFmt w:val="bullet"/>
@@ -10605,9 +11905,9 @@
     </w:lvl>
   </w:abstractNum>
   <w:abstractNum w:abstractNumId="4" w15:restartNumberingAfterBreak="0">
-    <w:nsid w:val="4CEF3128"/>
+    <w:nsid w:val="26B647B2"/>
     <w:multiLevelType w:val="multilevel"/>
-    <w:tmpl w:val="1DC22672"/>
+    <w:tmpl w:val="8342140A"/>
     <w:lvl w:ilvl="0">
       <w:start w:val="1"/>
       <w:numFmt w:val="bullet"/>
@@ -10754,9 +12054,9 @@
     </w:lvl>
   </w:abstractNum>
   <w:abstractNum w:abstractNumId="5" w15:restartNumberingAfterBreak="0">
-    <w:nsid w:val="5796578F"/>
+    <w:nsid w:val="320E0B82"/>
     <w:multiLevelType w:val="multilevel"/>
-    <w:tmpl w:val="970C4484"/>
+    <w:tmpl w:val="67A0C5AE"/>
     <w:lvl w:ilvl="0">
       <w:start w:val="1"/>
       <w:numFmt w:val="bullet"/>
@@ -10903,9 +12203,9 @@
     </w:lvl>
   </w:abstractNum>
   <w:abstractNum w:abstractNumId="6" w15:restartNumberingAfterBreak="0">
-    <w:nsid w:val="57AC2ADD"/>
+    <w:nsid w:val="3DB2253E"/>
     <w:multiLevelType w:val="multilevel"/>
-    <w:tmpl w:val="1716FFEE"/>
+    <w:tmpl w:val="F1E0B30A"/>
     <w:lvl w:ilvl="0">
       <w:start w:val="1"/>
       <w:numFmt w:val="bullet"/>
@@ -11052,9 +12352,9 @@
     </w:lvl>
   </w:abstractNum>
   <w:abstractNum w:abstractNumId="7" w15:restartNumberingAfterBreak="0">
-    <w:nsid w:val="69EF507F"/>
+    <w:nsid w:val="3DB627B7"/>
     <w:multiLevelType w:val="multilevel"/>
-    <w:tmpl w:val="DFAC709E"/>
+    <w:tmpl w:val="8F1C9D80"/>
     <w:lvl w:ilvl="0">
       <w:start w:val="1"/>
       <w:numFmt w:val="bullet"/>
@@ -11201,9 +12501,9 @@
     </w:lvl>
   </w:abstractNum>
   <w:abstractNum w:abstractNumId="8" w15:restartNumberingAfterBreak="0">
-    <w:nsid w:val="70007D95"/>
+    <w:nsid w:val="4CEF3128"/>
     <w:multiLevelType w:val="multilevel"/>
-    <w:tmpl w:val="385ED098"/>
+    <w:tmpl w:val="1DC22672"/>
     <w:lvl w:ilvl="0">
       <w:start w:val="1"/>
       <w:numFmt w:val="bullet"/>
@@ -11349,32 +12649,792 @@
       </w:rPr>
     </w:lvl>
   </w:abstractNum>
+  <w:abstractNum w:abstractNumId="9" w15:restartNumberingAfterBreak="0">
+    <w:nsid w:val="5796578F"/>
+    <w:multiLevelType w:val="multilevel"/>
+    <w:tmpl w:val="970C4484"/>
+    <w:lvl w:ilvl="0">
+      <w:start w:val="1"/>
+      <w:numFmt w:val="bullet"/>
+      <w:lvlText w:val=""/>
+      <w:lvlJc w:val="left"/>
+      <w:pPr>
+        <w:tabs>
+          <w:tab w:val="num" w:pos="720"/>
+        </w:tabs>
+        <w:ind w:left="720" w:hanging="360"/>
+      </w:pPr>
+      <w:rPr>
+        <w:rFonts w:ascii="Symbol" w:hAnsi="Symbol" w:hint="default"/>
+        <w:sz w:val="20"/>
+      </w:rPr>
+    </w:lvl>
+    <w:lvl w:ilvl="1" w:tentative="1">
+      <w:start w:val="1"/>
+      <w:numFmt w:val="bullet"/>
+      <w:lvlText w:val="o"/>
+      <w:lvlJc w:val="left"/>
+      <w:pPr>
+        <w:tabs>
+          <w:tab w:val="num" w:pos="1440"/>
+        </w:tabs>
+        <w:ind w:left="1440" w:hanging="360"/>
+      </w:pPr>
+      <w:rPr>
+        <w:rFonts w:ascii="Courier New" w:hAnsi="Courier New" w:hint="default"/>
+        <w:sz w:val="20"/>
+      </w:rPr>
+    </w:lvl>
+    <w:lvl w:ilvl="2" w:tentative="1">
+      <w:start w:val="1"/>
+      <w:numFmt w:val="bullet"/>
+      <w:lvlText w:val=""/>
+      <w:lvlJc w:val="left"/>
+      <w:pPr>
+        <w:tabs>
+          <w:tab w:val="num" w:pos="2160"/>
+        </w:tabs>
+        <w:ind w:left="2160" w:hanging="360"/>
+      </w:pPr>
+      <w:rPr>
+        <w:rFonts w:ascii="Wingdings" w:hAnsi="Wingdings" w:hint="default"/>
+        <w:sz w:val="20"/>
+      </w:rPr>
+    </w:lvl>
+    <w:lvl w:ilvl="3" w:tentative="1">
+      <w:start w:val="1"/>
+      <w:numFmt w:val="bullet"/>
+      <w:lvlText w:val=""/>
+      <w:lvlJc w:val="left"/>
+      <w:pPr>
+        <w:tabs>
+          <w:tab w:val="num" w:pos="2880"/>
+        </w:tabs>
+        <w:ind w:left="2880" w:hanging="360"/>
+      </w:pPr>
+      <w:rPr>
+        <w:rFonts w:ascii="Wingdings" w:hAnsi="Wingdings" w:hint="default"/>
+        <w:sz w:val="20"/>
+      </w:rPr>
+    </w:lvl>
+    <w:lvl w:ilvl="4" w:tentative="1">
+      <w:start w:val="1"/>
+      <w:numFmt w:val="bullet"/>
+      <w:lvlText w:val=""/>
+      <w:lvlJc w:val="left"/>
+      <w:pPr>
+        <w:tabs>
+          <w:tab w:val="num" w:pos="3600"/>
+        </w:tabs>
+        <w:ind w:left="3600" w:hanging="360"/>
+      </w:pPr>
+      <w:rPr>
+        <w:rFonts w:ascii="Wingdings" w:hAnsi="Wingdings" w:hint="default"/>
+        <w:sz w:val="20"/>
+      </w:rPr>
+    </w:lvl>
+    <w:lvl w:ilvl="5" w:tentative="1">
+      <w:start w:val="1"/>
+      <w:numFmt w:val="bullet"/>
+      <w:lvlText w:val=""/>
+      <w:lvlJc w:val="left"/>
+      <w:pPr>
+        <w:tabs>
+          <w:tab w:val="num" w:pos="4320"/>
+        </w:tabs>
+        <w:ind w:left="4320" w:hanging="360"/>
+      </w:pPr>
+      <w:rPr>
+        <w:rFonts w:ascii="Wingdings" w:hAnsi="Wingdings" w:hint="default"/>
+        <w:sz w:val="20"/>
+      </w:rPr>
+    </w:lvl>
+    <w:lvl w:ilvl="6" w:tentative="1">
+      <w:start w:val="1"/>
+      <w:numFmt w:val="bullet"/>
+      <w:lvlText w:val=""/>
+      <w:lvlJc w:val="left"/>
+      <w:pPr>
+        <w:tabs>
+          <w:tab w:val="num" w:pos="5040"/>
+        </w:tabs>
+        <w:ind w:left="5040" w:hanging="360"/>
+      </w:pPr>
+      <w:rPr>
+        <w:rFonts w:ascii="Wingdings" w:hAnsi="Wingdings" w:hint="default"/>
+        <w:sz w:val="20"/>
+      </w:rPr>
+    </w:lvl>
+    <w:lvl w:ilvl="7" w:tentative="1">
+      <w:start w:val="1"/>
+      <w:numFmt w:val="bullet"/>
+      <w:lvlText w:val=""/>
+      <w:lvlJc w:val="left"/>
+      <w:pPr>
+        <w:tabs>
+          <w:tab w:val="num" w:pos="5760"/>
+        </w:tabs>
+        <w:ind w:left="5760" w:hanging="360"/>
+      </w:pPr>
+      <w:rPr>
+        <w:rFonts w:ascii="Wingdings" w:hAnsi="Wingdings" w:hint="default"/>
+        <w:sz w:val="20"/>
+      </w:rPr>
+    </w:lvl>
+    <w:lvl w:ilvl="8" w:tentative="1">
+      <w:start w:val="1"/>
+      <w:numFmt w:val="bullet"/>
+      <w:lvlText w:val=""/>
+      <w:lvlJc w:val="left"/>
+      <w:pPr>
+        <w:tabs>
+          <w:tab w:val="num" w:pos="6480"/>
+        </w:tabs>
+        <w:ind w:left="6480" w:hanging="360"/>
+      </w:pPr>
+      <w:rPr>
+        <w:rFonts w:ascii="Wingdings" w:hAnsi="Wingdings" w:hint="default"/>
+        <w:sz w:val="20"/>
+      </w:rPr>
+    </w:lvl>
+  </w:abstractNum>
+  <w:abstractNum w:abstractNumId="10" w15:restartNumberingAfterBreak="0">
+    <w:nsid w:val="57AC2ADD"/>
+    <w:multiLevelType w:val="multilevel"/>
+    <w:tmpl w:val="1716FFEE"/>
+    <w:lvl w:ilvl="0">
+      <w:start w:val="1"/>
+      <w:numFmt w:val="bullet"/>
+      <w:lvlText w:val=""/>
+      <w:lvlJc w:val="left"/>
+      <w:pPr>
+        <w:tabs>
+          <w:tab w:val="num" w:pos="720"/>
+        </w:tabs>
+        <w:ind w:left="720" w:hanging="360"/>
+      </w:pPr>
+      <w:rPr>
+        <w:rFonts w:ascii="Symbol" w:hAnsi="Symbol" w:hint="default"/>
+        <w:sz w:val="20"/>
+      </w:rPr>
+    </w:lvl>
+    <w:lvl w:ilvl="1" w:tentative="1">
+      <w:start w:val="1"/>
+      <w:numFmt w:val="bullet"/>
+      <w:lvlText w:val="o"/>
+      <w:lvlJc w:val="left"/>
+      <w:pPr>
+        <w:tabs>
+          <w:tab w:val="num" w:pos="1440"/>
+        </w:tabs>
+        <w:ind w:left="1440" w:hanging="360"/>
+      </w:pPr>
+      <w:rPr>
+        <w:rFonts w:ascii="Courier New" w:hAnsi="Courier New" w:hint="default"/>
+        <w:sz w:val="20"/>
+      </w:rPr>
+    </w:lvl>
+    <w:lvl w:ilvl="2" w:tentative="1">
+      <w:start w:val="1"/>
+      <w:numFmt w:val="bullet"/>
+      <w:lvlText w:val=""/>
+      <w:lvlJc w:val="left"/>
+      <w:pPr>
+        <w:tabs>
+          <w:tab w:val="num" w:pos="2160"/>
+        </w:tabs>
+        <w:ind w:left="2160" w:hanging="360"/>
+      </w:pPr>
+      <w:rPr>
+        <w:rFonts w:ascii="Wingdings" w:hAnsi="Wingdings" w:hint="default"/>
+        <w:sz w:val="20"/>
+      </w:rPr>
+    </w:lvl>
+    <w:lvl w:ilvl="3" w:tentative="1">
+      <w:start w:val="1"/>
+      <w:numFmt w:val="bullet"/>
+      <w:lvlText w:val=""/>
+      <w:lvlJc w:val="left"/>
+      <w:pPr>
+        <w:tabs>
+          <w:tab w:val="num" w:pos="2880"/>
+        </w:tabs>
+        <w:ind w:left="2880" w:hanging="360"/>
+      </w:pPr>
+      <w:rPr>
+        <w:rFonts w:ascii="Wingdings" w:hAnsi="Wingdings" w:hint="default"/>
+        <w:sz w:val="20"/>
+      </w:rPr>
+    </w:lvl>
+    <w:lvl w:ilvl="4" w:tentative="1">
+      <w:start w:val="1"/>
+      <w:numFmt w:val="bullet"/>
+      <w:lvlText w:val=""/>
+      <w:lvlJc w:val="left"/>
+      <w:pPr>
+        <w:tabs>
+          <w:tab w:val="num" w:pos="3600"/>
+        </w:tabs>
+        <w:ind w:left="3600" w:hanging="360"/>
+      </w:pPr>
+      <w:rPr>
+        <w:rFonts w:ascii="Wingdings" w:hAnsi="Wingdings" w:hint="default"/>
+        <w:sz w:val="20"/>
+      </w:rPr>
+    </w:lvl>
+    <w:lvl w:ilvl="5" w:tentative="1">
+      <w:start w:val="1"/>
+      <w:numFmt w:val="bullet"/>
+      <w:lvlText w:val=""/>
+      <w:lvlJc w:val="left"/>
+      <w:pPr>
+        <w:tabs>
+          <w:tab w:val="num" w:pos="4320"/>
+        </w:tabs>
+        <w:ind w:left="4320" w:hanging="360"/>
+      </w:pPr>
+      <w:rPr>
+        <w:rFonts w:ascii="Wingdings" w:hAnsi="Wingdings" w:hint="default"/>
+        <w:sz w:val="20"/>
+      </w:rPr>
+    </w:lvl>
+    <w:lvl w:ilvl="6" w:tentative="1">
+      <w:start w:val="1"/>
+      <w:numFmt w:val="bullet"/>
+      <w:lvlText w:val=""/>
+      <w:lvlJc w:val="left"/>
+      <w:pPr>
+        <w:tabs>
+          <w:tab w:val="num" w:pos="5040"/>
+        </w:tabs>
+        <w:ind w:left="5040" w:hanging="360"/>
+      </w:pPr>
+      <w:rPr>
+        <w:rFonts w:ascii="Wingdings" w:hAnsi="Wingdings" w:hint="default"/>
+        <w:sz w:val="20"/>
+      </w:rPr>
+    </w:lvl>
+    <w:lvl w:ilvl="7" w:tentative="1">
+      <w:start w:val="1"/>
+      <w:numFmt w:val="bullet"/>
+      <w:lvlText w:val=""/>
+      <w:lvlJc w:val="left"/>
+      <w:pPr>
+        <w:tabs>
+          <w:tab w:val="num" w:pos="5760"/>
+        </w:tabs>
+        <w:ind w:left="5760" w:hanging="360"/>
+      </w:pPr>
+      <w:rPr>
+        <w:rFonts w:ascii="Wingdings" w:hAnsi="Wingdings" w:hint="default"/>
+        <w:sz w:val="20"/>
+      </w:rPr>
+    </w:lvl>
+    <w:lvl w:ilvl="8" w:tentative="1">
+      <w:start w:val="1"/>
+      <w:numFmt w:val="bullet"/>
+      <w:lvlText w:val=""/>
+      <w:lvlJc w:val="left"/>
+      <w:pPr>
+        <w:tabs>
+          <w:tab w:val="num" w:pos="6480"/>
+        </w:tabs>
+        <w:ind w:left="6480" w:hanging="360"/>
+      </w:pPr>
+      <w:rPr>
+        <w:rFonts w:ascii="Wingdings" w:hAnsi="Wingdings" w:hint="default"/>
+        <w:sz w:val="20"/>
+      </w:rPr>
+    </w:lvl>
+  </w:abstractNum>
+  <w:abstractNum w:abstractNumId="11" w15:restartNumberingAfterBreak="0">
+    <w:nsid w:val="69EF507F"/>
+    <w:multiLevelType w:val="multilevel"/>
+    <w:tmpl w:val="DFAC709E"/>
+    <w:lvl w:ilvl="0">
+      <w:start w:val="1"/>
+      <w:numFmt w:val="bullet"/>
+      <w:lvlText w:val=""/>
+      <w:lvlJc w:val="left"/>
+      <w:pPr>
+        <w:tabs>
+          <w:tab w:val="num" w:pos="720"/>
+        </w:tabs>
+        <w:ind w:left="720" w:hanging="360"/>
+      </w:pPr>
+      <w:rPr>
+        <w:rFonts w:ascii="Symbol" w:hAnsi="Symbol" w:hint="default"/>
+        <w:sz w:val="20"/>
+      </w:rPr>
+    </w:lvl>
+    <w:lvl w:ilvl="1" w:tentative="1">
+      <w:start w:val="1"/>
+      <w:numFmt w:val="bullet"/>
+      <w:lvlText w:val="o"/>
+      <w:lvlJc w:val="left"/>
+      <w:pPr>
+        <w:tabs>
+          <w:tab w:val="num" w:pos="1440"/>
+        </w:tabs>
+        <w:ind w:left="1440" w:hanging="360"/>
+      </w:pPr>
+      <w:rPr>
+        <w:rFonts w:ascii="Courier New" w:hAnsi="Courier New" w:hint="default"/>
+        <w:sz w:val="20"/>
+      </w:rPr>
+    </w:lvl>
+    <w:lvl w:ilvl="2" w:tentative="1">
+      <w:start w:val="1"/>
+      <w:numFmt w:val="bullet"/>
+      <w:lvlText w:val=""/>
+      <w:lvlJc w:val="left"/>
+      <w:pPr>
+        <w:tabs>
+          <w:tab w:val="num" w:pos="2160"/>
+        </w:tabs>
+        <w:ind w:left="2160" w:hanging="360"/>
+      </w:pPr>
+      <w:rPr>
+        <w:rFonts w:ascii="Wingdings" w:hAnsi="Wingdings" w:hint="default"/>
+        <w:sz w:val="20"/>
+      </w:rPr>
+    </w:lvl>
+    <w:lvl w:ilvl="3" w:tentative="1">
+      <w:start w:val="1"/>
+      <w:numFmt w:val="bullet"/>
+      <w:lvlText w:val=""/>
+      <w:lvlJc w:val="left"/>
+      <w:pPr>
+        <w:tabs>
+          <w:tab w:val="num" w:pos="2880"/>
+        </w:tabs>
+        <w:ind w:left="2880" w:hanging="360"/>
+      </w:pPr>
+      <w:rPr>
+        <w:rFonts w:ascii="Wingdings" w:hAnsi="Wingdings" w:hint="default"/>
+        <w:sz w:val="20"/>
+      </w:rPr>
+    </w:lvl>
+    <w:lvl w:ilvl="4" w:tentative="1">
+      <w:start w:val="1"/>
+      <w:numFmt w:val="bullet"/>
+      <w:lvlText w:val=""/>
+      <w:lvlJc w:val="left"/>
+      <w:pPr>
+        <w:tabs>
+          <w:tab w:val="num" w:pos="3600"/>
+        </w:tabs>
+        <w:ind w:left="3600" w:hanging="360"/>
+      </w:pPr>
+      <w:rPr>
+        <w:rFonts w:ascii="Wingdings" w:hAnsi="Wingdings" w:hint="default"/>
+        <w:sz w:val="20"/>
+      </w:rPr>
+    </w:lvl>
+    <w:lvl w:ilvl="5" w:tentative="1">
+      <w:start w:val="1"/>
+      <w:numFmt w:val="bullet"/>
+      <w:lvlText w:val=""/>
+      <w:lvlJc w:val="left"/>
+      <w:pPr>
+        <w:tabs>
+          <w:tab w:val="num" w:pos="4320"/>
+        </w:tabs>
+        <w:ind w:left="4320" w:hanging="360"/>
+      </w:pPr>
+      <w:rPr>
+        <w:rFonts w:ascii="Wingdings" w:hAnsi="Wingdings" w:hint="default"/>
+        <w:sz w:val="20"/>
+      </w:rPr>
+    </w:lvl>
+    <w:lvl w:ilvl="6" w:tentative="1">
+      <w:start w:val="1"/>
+      <w:numFmt w:val="bullet"/>
+      <w:lvlText w:val=""/>
+      <w:lvlJc w:val="left"/>
+      <w:pPr>
+        <w:tabs>
+          <w:tab w:val="num" w:pos="5040"/>
+        </w:tabs>
+        <w:ind w:left="5040" w:hanging="360"/>
+      </w:pPr>
+      <w:rPr>
+        <w:rFonts w:ascii="Wingdings" w:hAnsi="Wingdings" w:hint="default"/>
+        <w:sz w:val="20"/>
+      </w:rPr>
+    </w:lvl>
+    <w:lvl w:ilvl="7" w:tentative="1">
+      <w:start w:val="1"/>
+      <w:numFmt w:val="bullet"/>
+      <w:lvlText w:val=""/>
+      <w:lvlJc w:val="left"/>
+      <w:pPr>
+        <w:tabs>
+          <w:tab w:val="num" w:pos="5760"/>
+        </w:tabs>
+        <w:ind w:left="5760" w:hanging="360"/>
+      </w:pPr>
+      <w:rPr>
+        <w:rFonts w:ascii="Wingdings" w:hAnsi="Wingdings" w:hint="default"/>
+        <w:sz w:val="20"/>
+      </w:rPr>
+    </w:lvl>
+    <w:lvl w:ilvl="8" w:tentative="1">
+      <w:start w:val="1"/>
+      <w:numFmt w:val="bullet"/>
+      <w:lvlText w:val=""/>
+      <w:lvlJc w:val="left"/>
+      <w:pPr>
+        <w:tabs>
+          <w:tab w:val="num" w:pos="6480"/>
+        </w:tabs>
+        <w:ind w:left="6480" w:hanging="360"/>
+      </w:pPr>
+      <w:rPr>
+        <w:rFonts w:ascii="Wingdings" w:hAnsi="Wingdings" w:hint="default"/>
+        <w:sz w:val="20"/>
+      </w:rPr>
+    </w:lvl>
+  </w:abstractNum>
+  <w:abstractNum w:abstractNumId="12" w15:restartNumberingAfterBreak="0">
+    <w:nsid w:val="70007D95"/>
+    <w:multiLevelType w:val="multilevel"/>
+    <w:tmpl w:val="385ED098"/>
+    <w:lvl w:ilvl="0">
+      <w:start w:val="1"/>
+      <w:numFmt w:val="bullet"/>
+      <w:lvlText w:val=""/>
+      <w:lvlJc w:val="left"/>
+      <w:pPr>
+        <w:tabs>
+          <w:tab w:val="num" w:pos="720"/>
+        </w:tabs>
+        <w:ind w:left="720" w:hanging="360"/>
+      </w:pPr>
+      <w:rPr>
+        <w:rFonts w:ascii="Symbol" w:hAnsi="Symbol" w:hint="default"/>
+        <w:sz w:val="20"/>
+      </w:rPr>
+    </w:lvl>
+    <w:lvl w:ilvl="1" w:tentative="1">
+      <w:start w:val="1"/>
+      <w:numFmt w:val="bullet"/>
+      <w:lvlText w:val="o"/>
+      <w:lvlJc w:val="left"/>
+      <w:pPr>
+        <w:tabs>
+          <w:tab w:val="num" w:pos="1440"/>
+        </w:tabs>
+        <w:ind w:left="1440" w:hanging="360"/>
+      </w:pPr>
+      <w:rPr>
+        <w:rFonts w:ascii="Courier New" w:hAnsi="Courier New" w:hint="default"/>
+        <w:sz w:val="20"/>
+      </w:rPr>
+    </w:lvl>
+    <w:lvl w:ilvl="2" w:tentative="1">
+      <w:start w:val="1"/>
+      <w:numFmt w:val="bullet"/>
+      <w:lvlText w:val=""/>
+      <w:lvlJc w:val="left"/>
+      <w:pPr>
+        <w:tabs>
+          <w:tab w:val="num" w:pos="2160"/>
+        </w:tabs>
+        <w:ind w:left="2160" w:hanging="360"/>
+      </w:pPr>
+      <w:rPr>
+        <w:rFonts w:ascii="Wingdings" w:hAnsi="Wingdings" w:hint="default"/>
+        <w:sz w:val="20"/>
+      </w:rPr>
+    </w:lvl>
+    <w:lvl w:ilvl="3" w:tentative="1">
+      <w:start w:val="1"/>
+      <w:numFmt w:val="bullet"/>
+      <w:lvlText w:val=""/>
+      <w:lvlJc w:val="left"/>
+      <w:pPr>
+        <w:tabs>
+          <w:tab w:val="num" w:pos="2880"/>
+        </w:tabs>
+        <w:ind w:left="2880" w:hanging="360"/>
+      </w:pPr>
+      <w:rPr>
+        <w:rFonts w:ascii="Wingdings" w:hAnsi="Wingdings" w:hint="default"/>
+        <w:sz w:val="20"/>
+      </w:rPr>
+    </w:lvl>
+    <w:lvl w:ilvl="4" w:tentative="1">
+      <w:start w:val="1"/>
+      <w:numFmt w:val="bullet"/>
+      <w:lvlText w:val=""/>
+      <w:lvlJc w:val="left"/>
+      <w:pPr>
+        <w:tabs>
+          <w:tab w:val="num" w:pos="3600"/>
+        </w:tabs>
+        <w:ind w:left="3600" w:hanging="360"/>
+      </w:pPr>
+      <w:rPr>
+        <w:rFonts w:ascii="Wingdings" w:hAnsi="Wingdings" w:hint="default"/>
+        <w:sz w:val="20"/>
+      </w:rPr>
+    </w:lvl>
+    <w:lvl w:ilvl="5" w:tentative="1">
+      <w:start w:val="1"/>
+      <w:numFmt w:val="bullet"/>
+      <w:lvlText w:val=""/>
+      <w:lvlJc w:val="left"/>
+      <w:pPr>
+        <w:tabs>
+          <w:tab w:val="num" w:pos="4320"/>
+        </w:tabs>
+        <w:ind w:left="4320" w:hanging="360"/>
+      </w:pPr>
+      <w:rPr>
+        <w:rFonts w:ascii="Wingdings" w:hAnsi="Wingdings" w:hint="default"/>
+        <w:sz w:val="20"/>
+      </w:rPr>
+    </w:lvl>
+    <w:lvl w:ilvl="6" w:tentative="1">
+      <w:start w:val="1"/>
+      <w:numFmt w:val="bullet"/>
+      <w:lvlText w:val=""/>
+      <w:lvlJc w:val="left"/>
+      <w:pPr>
+        <w:tabs>
+          <w:tab w:val="num" w:pos="5040"/>
+        </w:tabs>
+        <w:ind w:left="5040" w:hanging="360"/>
+      </w:pPr>
+      <w:rPr>
+        <w:rFonts w:ascii="Wingdings" w:hAnsi="Wingdings" w:hint="default"/>
+        <w:sz w:val="20"/>
+      </w:rPr>
+    </w:lvl>
+    <w:lvl w:ilvl="7" w:tentative="1">
+      <w:start w:val="1"/>
+      <w:numFmt w:val="bullet"/>
+      <w:lvlText w:val=""/>
+      <w:lvlJc w:val="left"/>
+      <w:pPr>
+        <w:tabs>
+          <w:tab w:val="num" w:pos="5760"/>
+        </w:tabs>
+        <w:ind w:left="5760" w:hanging="360"/>
+      </w:pPr>
+      <w:rPr>
+        <w:rFonts w:ascii="Wingdings" w:hAnsi="Wingdings" w:hint="default"/>
+        <w:sz w:val="20"/>
+      </w:rPr>
+    </w:lvl>
+    <w:lvl w:ilvl="8" w:tentative="1">
+      <w:start w:val="1"/>
+      <w:numFmt w:val="bullet"/>
+      <w:lvlText w:val=""/>
+      <w:lvlJc w:val="left"/>
+      <w:pPr>
+        <w:tabs>
+          <w:tab w:val="num" w:pos="6480"/>
+        </w:tabs>
+        <w:ind w:left="6480" w:hanging="360"/>
+      </w:pPr>
+      <w:rPr>
+        <w:rFonts w:ascii="Wingdings" w:hAnsi="Wingdings" w:hint="default"/>
+        <w:sz w:val="20"/>
+      </w:rPr>
+    </w:lvl>
+  </w:abstractNum>
+  <w:abstractNum w:abstractNumId="13" w15:restartNumberingAfterBreak="0">
+    <w:nsid w:val="7B47185F"/>
+    <w:multiLevelType w:val="multilevel"/>
+    <w:tmpl w:val="607606C4"/>
+    <w:lvl w:ilvl="0">
+      <w:start w:val="1"/>
+      <w:numFmt w:val="bullet"/>
+      <w:lvlText w:val=""/>
+      <w:lvlJc w:val="left"/>
+      <w:pPr>
+        <w:tabs>
+          <w:tab w:val="num" w:pos="720"/>
+        </w:tabs>
+        <w:ind w:left="720" w:hanging="360"/>
+      </w:pPr>
+      <w:rPr>
+        <w:rFonts w:ascii="Symbol" w:hAnsi="Symbol" w:hint="default"/>
+        <w:sz w:val="20"/>
+      </w:rPr>
+    </w:lvl>
+    <w:lvl w:ilvl="1" w:tentative="1">
+      <w:start w:val="1"/>
+      <w:numFmt w:val="bullet"/>
+      <w:lvlText w:val="o"/>
+      <w:lvlJc w:val="left"/>
+      <w:pPr>
+        <w:tabs>
+          <w:tab w:val="num" w:pos="1440"/>
+        </w:tabs>
+        <w:ind w:left="1440" w:hanging="360"/>
+      </w:pPr>
+      <w:rPr>
+        <w:rFonts w:ascii="Courier New" w:hAnsi="Courier New" w:hint="default"/>
+        <w:sz w:val="20"/>
+      </w:rPr>
+    </w:lvl>
+    <w:lvl w:ilvl="2" w:tentative="1">
+      <w:start w:val="1"/>
+      <w:numFmt w:val="bullet"/>
+      <w:lvlText w:val=""/>
+      <w:lvlJc w:val="left"/>
+      <w:pPr>
+        <w:tabs>
+          <w:tab w:val="num" w:pos="2160"/>
+        </w:tabs>
+        <w:ind w:left="2160" w:hanging="360"/>
+      </w:pPr>
+      <w:rPr>
+        <w:rFonts w:ascii="Wingdings" w:hAnsi="Wingdings" w:hint="default"/>
+        <w:sz w:val="20"/>
+      </w:rPr>
+    </w:lvl>
+    <w:lvl w:ilvl="3" w:tentative="1">
+      <w:start w:val="1"/>
+      <w:numFmt w:val="bullet"/>
+      <w:lvlText w:val=""/>
+      <w:lvlJc w:val="left"/>
+      <w:pPr>
+        <w:tabs>
+          <w:tab w:val="num" w:pos="2880"/>
+        </w:tabs>
+        <w:ind w:left="2880" w:hanging="360"/>
+      </w:pPr>
+      <w:rPr>
+        <w:rFonts w:ascii="Wingdings" w:hAnsi="Wingdings" w:hint="default"/>
+        <w:sz w:val="20"/>
+      </w:rPr>
+    </w:lvl>
+    <w:lvl w:ilvl="4" w:tentative="1">
+      <w:start w:val="1"/>
+      <w:numFmt w:val="bullet"/>
+      <w:lvlText w:val=""/>
+      <w:lvlJc w:val="left"/>
+      <w:pPr>
+        <w:tabs>
+          <w:tab w:val="num" w:pos="3600"/>
+        </w:tabs>
+        <w:ind w:left="3600" w:hanging="360"/>
+      </w:pPr>
+      <w:rPr>
+        <w:rFonts w:ascii="Wingdings" w:hAnsi="Wingdings" w:hint="default"/>
+        <w:sz w:val="20"/>
+      </w:rPr>
+    </w:lvl>
+    <w:lvl w:ilvl="5" w:tentative="1">
+      <w:start w:val="1"/>
+      <w:numFmt w:val="bullet"/>
+      <w:lvlText w:val=""/>
+      <w:lvlJc w:val="left"/>
+      <w:pPr>
+        <w:tabs>
+          <w:tab w:val="num" w:pos="4320"/>
+        </w:tabs>
+        <w:ind w:left="4320" w:hanging="360"/>
+      </w:pPr>
+      <w:rPr>
+        <w:rFonts w:ascii="Wingdings" w:hAnsi="Wingdings" w:hint="default"/>
+        <w:sz w:val="20"/>
+      </w:rPr>
+    </w:lvl>
+    <w:lvl w:ilvl="6" w:tentative="1">
+      <w:start w:val="1"/>
+      <w:numFmt w:val="bullet"/>
+      <w:lvlText w:val=""/>
+      <w:lvlJc w:val="left"/>
+      <w:pPr>
+        <w:tabs>
+          <w:tab w:val="num" w:pos="5040"/>
+        </w:tabs>
+        <w:ind w:left="5040" w:hanging="360"/>
+      </w:pPr>
+      <w:rPr>
+        <w:rFonts w:ascii="Wingdings" w:hAnsi="Wingdings" w:hint="default"/>
+        <w:sz w:val="20"/>
+      </w:rPr>
+    </w:lvl>
+    <w:lvl w:ilvl="7" w:tentative="1">
+      <w:start w:val="1"/>
+      <w:numFmt w:val="bullet"/>
+      <w:lvlText w:val=""/>
+      <w:lvlJc w:val="left"/>
+      <w:pPr>
+        <w:tabs>
+          <w:tab w:val="num" w:pos="5760"/>
+        </w:tabs>
+        <w:ind w:left="5760" w:hanging="360"/>
+      </w:pPr>
+      <w:rPr>
+        <w:rFonts w:ascii="Wingdings" w:hAnsi="Wingdings" w:hint="default"/>
+        <w:sz w:val="20"/>
+      </w:rPr>
+    </w:lvl>
+    <w:lvl w:ilvl="8" w:tentative="1">
+      <w:start w:val="1"/>
+      <w:numFmt w:val="bullet"/>
+      <w:lvlText w:val=""/>
+      <w:lvlJc w:val="left"/>
+      <w:pPr>
+        <w:tabs>
+          <w:tab w:val="num" w:pos="6480"/>
+        </w:tabs>
+        <w:ind w:left="6480" w:hanging="360"/>
+      </w:pPr>
+      <w:rPr>
+        <w:rFonts w:ascii="Wingdings" w:hAnsi="Wingdings" w:hint="default"/>
+        <w:sz w:val="20"/>
+      </w:rPr>
+    </w:lvl>
+  </w:abstractNum>
   <w:num w:numId="1" w16cid:durableId="280691300">
-    <w:abstractNumId w:val="2"/>
+    <w:abstractNumId w:val="5"/>
   </w:num>
   <w:num w:numId="2" w16cid:durableId="172646460">
-    <w:abstractNumId w:val="8"/>
+    <w:abstractNumId w:val="12"/>
   </w:num>
   <w:num w:numId="3" w16cid:durableId="33846187">
-    <w:abstractNumId w:val="6"/>
+    <w:abstractNumId w:val="10"/>
   </w:num>
   <w:num w:numId="4" w16cid:durableId="512036652">
     <w:abstractNumId w:val="0"/>
   </w:num>
   <w:num w:numId="5" w16cid:durableId="500659820">
+    <w:abstractNumId w:val="6"/>
+  </w:num>
+  <w:num w:numId="6" w16cid:durableId="21175598">
+    <w:abstractNumId w:val="9"/>
+  </w:num>
+  <w:num w:numId="7" w16cid:durableId="507451992">
+    <w:abstractNumId w:val="4"/>
+  </w:num>
+  <w:num w:numId="8" w16cid:durableId="912929687">
+    <w:abstractNumId w:val="8"/>
+  </w:num>
+  <w:num w:numId="9" w16cid:durableId="2052532868">
+    <w:abstractNumId w:val="11"/>
+  </w:num>
+  <w:num w:numId="10" w16cid:durableId="632712616">
     <w:abstractNumId w:val="3"/>
   </w:num>
-  <w:num w:numId="6" w16cid:durableId="21175598">
-    <w:abstractNumId w:val="5"/>
-  </w:num>
-  <w:num w:numId="7" w16cid:durableId="507451992">
+  <w:num w:numId="11" w16cid:durableId="1696928692">
     <w:abstractNumId w:val="1"/>
   </w:num>
-  <w:num w:numId="8" w16cid:durableId="912929687">
-    <w:abstractNumId w:val="4"/>
+  <w:num w:numId="12" w16cid:durableId="1927298471">
+    <w:abstractNumId w:val="7"/>
   </w:num>
-  <w:num w:numId="9" w16cid:durableId="2052532868">
-    <w:abstractNumId w:val="7"/>
+  <w:num w:numId="13" w16cid:durableId="1724478748">
+    <w:abstractNumId w:val="13"/>
+  </w:num>
+  <w:num w:numId="14" w16cid:durableId="220411815">
+    <w:abstractNumId w:val="2"/>
   </w:num>
 </w:numbering>
 </file>
@@ -11983,7 +14043,6 @@
   <w:style w:type="character" w:default="1" w:styleId="VarsaylanParagrafYazTipi">
     <w:name w:val="Default Paragraph Font"/>
     <w:uiPriority w:val="1"/>
-    <w:semiHidden/>
     <w:unhideWhenUsed/>
   </w:style>
   <w:style w:type="table" w:default="1" w:styleId="NormalTablo">

</xml_diff>